<commit_message>
Regenera documento de entrega compatible
</commit_message>
<xml_diff>
--- a/docs/U1-SH-DWP-ValdezLaraYahirAlejandro.docx
+++ b/docs/U1-SH-DWP-ValdezLaraYahirAlejandro.docx
@@ -2,11 +2,20 @@
 <file path=word/document.xml><?xml version="1.0" encoding="utf-8"?>
 <w:document xmlns:wpc="http://schemas.microsoft.com/office/word/2010/wordprocessingCanvas" xmlns:mo="http://schemas.microsoft.com/office/mac/office/2008/main" xmlns:mc="http://schemas.openxmlformats.org/markup-compatibility/2006" xmlns:mv="urn:schemas-microsoft-com:mac:vml" xmlns:o="urn:schemas-microsoft-com:office:office" xmlns:r="http://schemas.openxmlformats.org/officeDocument/2006/relationships" xmlns:m="http://schemas.openxmlformats.org/officeDocument/2006/math" xmlns:v="urn:schemas-microsoft-com:vml" xmlns:wp14="http://schemas.microsoft.com/office/word/2010/wordprocessingDrawing" xmlns:wp="http://schemas.openxmlformats.org/drawingml/2006/wordprocessingDrawing" xmlns:w10="urn:schemas-microsoft-com:office:word" xmlns:w="http://schemas.openxmlformats.org/wordprocessingml/2006/main" xmlns:w14="http://schemas.microsoft.com/office/word/2010/wordml" xmlns:wpg="http://schemas.microsoft.com/office/word/2010/wordprocessingGroup" xmlns:wpi="http://schemas.microsoft.com/office/word/2010/wordprocessingInk" xmlns:wne="http://schemas.microsoft.com/office/word/2006/wordml" xmlns:wps="http://schemas.microsoft.com/office/word/2010/wordprocessingShape" mc:Ignorable="w14 wp14">
   <w:body>
-    <w:p/>
-    <w:p/>
     <w:p>
       <w:pPr>
-        <w:spacing w:line="360" w:lineRule="auto" w:after="120"/>
+        <w:jc w:val="center"/>
+      </w:pPr>
+      <w:r>
+        <w:rPr>
+          <w:rFonts w:ascii="Arial" w:hAnsi="Arial"/>
+          <w:b w:val="0"/>
+          <w:sz w:val="24"/>
+        </w:rPr>
+      </w:r>
+    </w:p>
+    <w:p>
+      <w:pPr>
         <w:jc w:val="center"/>
       </w:pPr>
       <w:r>
@@ -15,12 +24,11 @@
           <w:b/>
           <w:sz w:val="32"/>
         </w:rPr>
-        <w:t>Ingenier?a en Desarrollo y Gesti?n de Software</w:t>
+        <w:t>Ingenieria en Desarrollo y Gestion de Software</w:t>
       </w:r>
     </w:p>
     <w:p>
       <w:pPr>
-        <w:spacing w:line="360" w:lineRule="auto" w:after="120"/>
         <w:jc w:val="center"/>
       </w:pPr>
       <w:r>
@@ -32,17 +40,26 @@
         <w:t>Desarrollo Web Profesional</w:t>
       </w:r>
     </w:p>
-    <w:p/>
     <w:p>
       <w:pPr>
-        <w:spacing w:line="360" w:lineRule="auto" w:after="120"/>
+        <w:jc w:val="center"/>
+      </w:pPr>
+      <w:r>
+        <w:rPr>
+          <w:rFonts w:ascii="Arial" w:hAnsi="Arial"/>
+          <w:b w:val="0"/>
+          <w:sz w:val="24"/>
+        </w:rPr>
+      </w:r>
+    </w:p>
+    <w:p>
+      <w:pPr>
         <w:jc w:val="center"/>
       </w:pPr>
       <w:r>
         <w:rPr>
           <w:rFonts w:ascii="Arial" w:hAnsi="Arial"/>
           <w:b/>
-          <w:color w:val="E67E00"/>
           <w:sz w:val="36"/>
         </w:rPr>
         <w:t>Unidad 1 - Proyecto Web</w:t>
@@ -50,7 +67,6 @@
     </w:p>
     <w:p>
       <w:pPr>
-        <w:spacing w:line="360" w:lineRule="auto" w:after="120"/>
         <w:jc w:val="center"/>
       </w:pPr>
       <w:r>
@@ -59,12 +75,11 @@
           <w:b/>
           <w:sz w:val="44"/>
         </w:rPr>
-        <w:t>Ferreter?a Valdez</w:t>
+        <w:t>Ferreteria Valdez</w:t>
       </w:r>
     </w:p>
     <w:p>
       <w:pPr>
-        <w:spacing w:line="360" w:lineRule="auto" w:after="120"/>
         <w:jc w:val="center"/>
       </w:pPr>
       <w:r>
@@ -73,12 +88,33 @@
           <w:b w:val="0"/>
           <w:sz w:val="24"/>
         </w:rPr>
-        <w:t>Sitio web con frontend Stitch, cat?logo, formularios, backend Node.js y almacenamiento JSON</w:t>
+        <w:t>Sitio web con frontend Stitch, catalogo, formularios y backend Node.js</w:t>
       </w:r>
     </w:p>
-    <w:p/>
-    <w:p/>
-    <w:p/>
+    <w:p>
+      <w:pPr>
+        <w:jc w:val="center"/>
+      </w:pPr>
+      <w:r>
+        <w:rPr>
+          <w:rFonts w:ascii="Arial" w:hAnsi="Arial"/>
+          <w:b w:val="0"/>
+          <w:sz w:val="24"/>
+        </w:rPr>
+      </w:r>
+    </w:p>
+    <w:p>
+      <w:pPr>
+        <w:jc w:val="center"/>
+      </w:pPr>
+      <w:r>
+        <w:rPr>
+          <w:rFonts w:ascii="Arial" w:hAnsi="Arial"/>
+          <w:b w:val="0"/>
+          <w:sz w:val="24"/>
+        </w:rPr>
+      </w:r>
+    </w:p>
     <w:tbl>
       <w:tblPr>
         <w:tblStyle w:val="TableGrid"/>
@@ -93,40 +129,59 @@
       <w:tr>
         <w:tc>
           <w:tcPr>
-            <w:tcW w:type="dxa" w:w="2304"/>
-            <w:shd w:fill="F59E0B"/>
-            <w:vAlign w:val="center"/>
+            <w:tcW w:type="dxa" w:w="4703"/>
           </w:tcPr>
           <w:p>
-            <w:pPr>
-              <w:jc w:val="center"/>
-            </w:pPr>
-            <w:r/>
             <w:r>
               <w:rPr>
                 <w:rFonts w:ascii="Arial" w:hAnsi="Arial"/>
                 <w:b/>
-                <w:sz w:val="18"/>
+                <w:sz w:val="20"/>
               </w:rPr>
-              <w:t>Elaborado por:</w:t>
+              <w:t>Dato</w:t>
             </w:r>
           </w:p>
         </w:tc>
         <w:tc>
           <w:tcPr>
-            <w:tcW w:type="dxa" w:w="6768"/>
-            <w:vAlign w:val="center"/>
+            <w:tcW w:type="dxa" w:w="4703"/>
           </w:tcPr>
           <w:p>
-            <w:pPr>
-              <w:jc w:val="left"/>
-            </w:pPr>
-            <w:r/>
             <w:r>
               <w:rPr>
                 <w:rFonts w:ascii="Arial" w:hAnsi="Arial"/>
-                <w:b w:val="0"/>
-                <w:sz w:val="18"/>
+                <w:b/>
+                <w:sz w:val="20"/>
+              </w:rPr>
+              <w:t>Informacion</w:t>
+            </w:r>
+          </w:p>
+        </w:tc>
+      </w:tr>
+      <w:tr>
+        <w:tc>
+          <w:tcPr>
+            <w:tcW w:type="dxa" w:w="4703"/>
+          </w:tcPr>
+          <w:p>
+            <w:r>
+              <w:rPr>
+                <w:rFonts w:ascii="Arial" w:hAnsi="Arial"/>
+                <w:sz w:val="20"/>
+              </w:rPr>
+              <w:t>Elaborado por</w:t>
+            </w:r>
+          </w:p>
+        </w:tc>
+        <w:tc>
+          <w:tcPr>
+            <w:tcW w:type="dxa" w:w="4703"/>
+          </w:tcPr>
+          <w:p>
+            <w:r>
+              <w:rPr>
+                <w:rFonts w:ascii="Arial" w:hAnsi="Arial"/>
+                <w:sz w:val="20"/>
               </w:rPr>
               <w:t>Yahir Alejandro Valdez Lara</w:t>
             </w:r>
@@ -136,40 +191,27 @@
       <w:tr>
         <w:tc>
           <w:tcPr>
-            <w:tcW w:type="dxa" w:w="2304"/>
-            <w:shd w:fill="F59E0B"/>
-            <w:vAlign w:val="center"/>
+            <w:tcW w:type="dxa" w:w="4703"/>
           </w:tcPr>
           <w:p>
-            <w:pPr>
-              <w:jc w:val="center"/>
-            </w:pPr>
-            <w:r/>
             <w:r>
               <w:rPr>
                 <w:rFonts w:ascii="Arial" w:hAnsi="Arial"/>
-                <w:b/>
-                <w:sz w:val="18"/>
+                <w:sz w:val="20"/>
               </w:rPr>
-              <w:t>Matr?cula:</w:t>
+              <w:t>Matricula</w:t>
             </w:r>
           </w:p>
         </w:tc>
         <w:tc>
           <w:tcPr>
-            <w:tcW w:type="dxa" w:w="6768"/>
-            <w:vAlign w:val="center"/>
+            <w:tcW w:type="dxa" w:w="4703"/>
           </w:tcPr>
           <w:p>
-            <w:pPr>
-              <w:jc w:val="left"/>
-            </w:pPr>
-            <w:r/>
             <w:r>
               <w:rPr>
                 <w:rFonts w:ascii="Arial" w:hAnsi="Arial"/>
-                <w:b w:val="0"/>
-                <w:sz w:val="18"/>
+                <w:sz w:val="20"/>
               </w:rPr>
               <w:t>23040027</w:t>
             </w:r>
@@ -179,40 +221,27 @@
       <w:tr>
         <w:tc>
           <w:tcPr>
-            <w:tcW w:type="dxa" w:w="2304"/>
-            <w:shd w:fill="F59E0B"/>
-            <w:vAlign w:val="center"/>
+            <w:tcW w:type="dxa" w:w="4703"/>
           </w:tcPr>
           <w:p>
-            <w:pPr>
-              <w:jc w:val="center"/>
-            </w:pPr>
-            <w:r/>
             <w:r>
               <w:rPr>
                 <w:rFonts w:ascii="Arial" w:hAnsi="Arial"/>
-                <w:b/>
-                <w:sz w:val="18"/>
+                <w:sz w:val="20"/>
               </w:rPr>
-              <w:t>Grupo:</w:t>
+              <w:t>Grupo</w:t>
             </w:r>
           </w:p>
         </w:tc>
         <w:tc>
           <w:tcPr>
-            <w:tcW w:type="dxa" w:w="6768"/>
-            <w:vAlign w:val="center"/>
+            <w:tcW w:type="dxa" w:w="4703"/>
           </w:tcPr>
           <w:p>
-            <w:pPr>
-              <w:jc w:val="left"/>
-            </w:pPr>
-            <w:r/>
             <w:r>
               <w:rPr>
                 <w:rFonts w:ascii="Arial" w:hAnsi="Arial"/>
-                <w:b w:val="0"/>
-                <w:sz w:val="18"/>
+                <w:sz w:val="20"/>
               </w:rPr>
               <w:t>8 IDGS B</w:t>
             </w:r>
@@ -222,40 +251,27 @@
       <w:tr>
         <w:tc>
           <w:tcPr>
-            <w:tcW w:type="dxa" w:w="2304"/>
-            <w:shd w:fill="F59E0B"/>
-            <w:vAlign w:val="center"/>
+            <w:tcW w:type="dxa" w:w="4703"/>
           </w:tcPr>
           <w:p>
-            <w:pPr>
-              <w:jc w:val="center"/>
-            </w:pPr>
-            <w:r/>
             <w:r>
               <w:rPr>
                 <w:rFonts w:ascii="Arial" w:hAnsi="Arial"/>
-                <w:b/>
-                <w:sz w:val="18"/>
+                <w:sz w:val="20"/>
               </w:rPr>
-              <w:t>Docente:</w:t>
+              <w:t>Docente</w:t>
             </w:r>
           </w:p>
         </w:tc>
         <w:tc>
           <w:tcPr>
-            <w:tcW w:type="dxa" w:w="6768"/>
-            <w:vAlign w:val="center"/>
+            <w:tcW w:type="dxa" w:w="4703"/>
           </w:tcPr>
           <w:p>
-            <w:pPr>
-              <w:jc w:val="left"/>
-            </w:pPr>
-            <w:r/>
             <w:r>
               <w:rPr>
                 <w:rFonts w:ascii="Arial" w:hAnsi="Arial"/>
-                <w:b w:val="0"/>
-                <w:sz w:val="18"/>
+                <w:sz w:val="20"/>
               </w:rPr>
               <w:t>Gabriel Alejandro Reyes Morales</w:t>
             </w:r>
@@ -265,40 +281,27 @@
       <w:tr>
         <w:tc>
           <w:tcPr>
-            <w:tcW w:type="dxa" w:w="2304"/>
-            <w:shd w:fill="F59E0B"/>
-            <w:vAlign w:val="center"/>
+            <w:tcW w:type="dxa" w:w="4703"/>
           </w:tcPr>
           <w:p>
-            <w:pPr>
-              <w:jc w:val="center"/>
-            </w:pPr>
-            <w:r/>
             <w:r>
               <w:rPr>
                 <w:rFonts w:ascii="Arial" w:hAnsi="Arial"/>
-                <w:b/>
-                <w:sz w:val="18"/>
+                <w:sz w:val="20"/>
               </w:rPr>
-              <w:t>Repositorio:</w:t>
+              <w:t>Repositorio</w:t>
             </w:r>
           </w:p>
         </w:tc>
         <w:tc>
           <w:tcPr>
-            <w:tcW w:type="dxa" w:w="6768"/>
-            <w:vAlign w:val="center"/>
+            <w:tcW w:type="dxa" w:w="4703"/>
           </w:tcPr>
           <w:p>
-            <w:pPr>
-              <w:jc w:val="left"/>
-            </w:pPr>
-            <w:r/>
             <w:r>
               <w:rPr>
                 <w:rFonts w:ascii="Arial" w:hAnsi="Arial"/>
-                <w:b w:val="0"/>
-                <w:sz w:val="18"/>
+                <w:sz w:val="20"/>
               </w:rPr>
               <w:t>https://github.com/AlejandroVz0/ValdezLaraYahirAlejandroUnidad1</w:t>
             </w:r>
@@ -307,12 +310,8 @@
       </w:tr>
     </w:tbl>
     <w:p/>
-    <w:p/>
-    <w:p/>
-    <w:p/>
     <w:p>
       <w:pPr>
-        <w:spacing w:line="360" w:lineRule="auto" w:after="120"/>
         <w:jc w:val="center"/>
       </w:pPr>
       <w:r>
@@ -337,38 +336,29 @@
         <w:rPr>
           <w:rFonts w:ascii="Arial" w:hAnsi="Arial"/>
           <w:b/>
-          <w:color w:val="262626"/>
-          <w:sz w:val="32"/>
+          <w:sz w:val="28"/>
         </w:rPr>
-        <w:t>Introducci?n</w:t>
+        <w:t>Introduccion</w:t>
       </w:r>
     </w:p>
     <w:p>
-      <w:pPr>
-        <w:spacing w:line="360" w:lineRule="auto" w:after="120"/>
-        <w:jc w:val="both"/>
-      </w:pPr>
       <w:r>
         <w:rPr>
           <w:rFonts w:ascii="Arial" w:hAnsi="Arial"/>
           <w:b w:val="0"/>
           <w:sz w:val="24"/>
         </w:rPr>
-        <w:t>El presente documento describe el desarrollo del sitio web Ferreter?a Valdez, una ferreter?a ficticia inspirada en negocios reales de Ramos Arizpe, Coahuila. El objetivo principal del proyecto es presentar un cat?logo de productos, atraer clientes y permitir cotizaciones mediante WhatsApp, manteniendo una experiencia profesional, clara y f?cil de usar.</w:t>
+        <w:t>El presente documento describe el desarrollo del sitio web Ferreteria Valdez, una ferreteria ficticia inspirada en negocios reales de Ramos Arizpe, Coahuila. El sitio muestra catalogo de productos, permite cotizaciones y presenta formularios funcionales conectados a un backend basico.</w:t>
       </w:r>
     </w:p>
     <w:p>
-      <w:pPr>
-        <w:spacing w:line="360" w:lineRule="auto" w:after="120"/>
-        <w:jc w:val="both"/>
-      </w:pPr>
       <w:r>
         <w:rPr>
           <w:rFonts w:ascii="Arial" w:hAnsi="Arial"/>
           <w:b w:val="0"/>
           <w:sz w:val="24"/>
         </w:rPr>
-        <w:t>El sitio fue construido con React, Vite, Tailwind CSS, JavaScript/TypeScript y un backend b?sico en Node.js que guarda informaci?n en archivos JSON. El dise?o visual toma como base el frontend generado en Stitch, conservando su UI/UX, colores, im?genes y estructura visual.</w:t>
+        <w:t>La interfaz visual toma como base el frontend generado en Stitch y se adapto para cumplir con los requisitos de la Unidad 1: ayuda, mapa del sitio, pagina 404, contacto, login, registro, recuperacion y almacenamiento JSON.</w:t>
       </w:r>
     </w:p>
     <w:p>
@@ -379,38 +369,9 @@
         <w:rPr>
           <w:rFonts w:ascii="Arial" w:hAnsi="Arial"/>
           <w:b/>
-          <w:color w:val="262626"/>
-          <w:sz w:val="32"/>
+          <w:sz w:val="28"/>
         </w:rPr>
-        <w:t>Objetivo del sitio</w:t>
-      </w:r>
-    </w:p>
-    <w:p>
-      <w:pPr>
-        <w:spacing w:line="360" w:lineRule="auto" w:after="120"/>
-        <w:jc w:val="both"/>
-      </w:pPr>
-      <w:r>
-        <w:rPr>
-          <w:rFonts w:ascii="Arial" w:hAnsi="Arial"/>
-          <w:b w:val="0"/>
-          <w:sz w:val="24"/>
-        </w:rPr>
-        <w:t>Crear un sitio web funcional para Ferreter?a Valdez que cumpla con los requisitos de la Unidad 1: navegaci?n completa, cat?logo, carrito simulado, formularios validados, verificaci?n humana, mapa del sitio, p?gina 404 personalizada, ayuda, contacto y backend con almacenamiento JSON.</w:t>
-      </w:r>
-    </w:p>
-    <w:p>
-      <w:pPr>
-        <w:spacing w:before="200" w:after="120"/>
-      </w:pPr>
-      <w:r>
-        <w:rPr>
-          <w:rFonts w:ascii="Arial" w:hAnsi="Arial"/>
-          <w:b/>
-          <w:color w:val="262626"/>
-          <w:sz w:val="32"/>
-        </w:rPr>
-        <w:t>Tecnolog?as utilizadas</w:t>
+        <w:t>Tecnologias utilizadas</w:t>
       </w:r>
     </w:p>
     <w:tbl>
@@ -428,44 +389,30 @@
         <w:tc>
           <w:tcPr>
             <w:tcW w:type="dxa" w:w="4703"/>
-            <w:shd w:fill="262626"/>
-            <w:vAlign w:val="center"/>
           </w:tcPr>
           <w:p>
-            <w:pPr>
-              <w:jc w:val="center"/>
-            </w:pPr>
-            <w:r/>
             <w:r>
               <w:rPr>
                 <w:rFonts w:ascii="Arial" w:hAnsi="Arial"/>
                 <w:b/>
-                <w:color w:val="FFFFFF"/>
-                <w:sz w:val="18"/>
+                <w:sz w:val="20"/>
               </w:rPr>
-              <w:t>Elemento</w:t>
+              <w:t>Tecnologia</w:t>
             </w:r>
           </w:p>
         </w:tc>
         <w:tc>
           <w:tcPr>
             <w:tcW w:type="dxa" w:w="4703"/>
-            <w:shd w:fill="262626"/>
-            <w:vAlign w:val="center"/>
           </w:tcPr>
           <w:p>
-            <w:pPr>
-              <w:jc w:val="center"/>
-            </w:pPr>
-            <w:r/>
             <w:r>
               <w:rPr>
                 <w:rFonts w:ascii="Arial" w:hAnsi="Arial"/>
                 <w:b/>
-                <w:color w:val="FFFFFF"/>
-                <w:sz w:val="18"/>
+                <w:sz w:val="20"/>
               </w:rPr>
-              <w:t>Uso en el proyecto</w:t>
+              <w:t>Uso</w:t>
             </w:r>
           </w:p>
         </w:tc>
@@ -474,18 +421,12 @@
         <w:tc>
           <w:tcPr>
             <w:tcW w:type="dxa" w:w="4703"/>
-            <w:vAlign w:val="center"/>
           </w:tcPr>
           <w:p>
-            <w:pPr>
-              <w:jc w:val="left"/>
-            </w:pPr>
-            <w:r/>
             <w:r>
               <w:rPr>
                 <w:rFonts w:ascii="Arial" w:hAnsi="Arial"/>
-                <w:b w:val="0"/>
-                <w:sz w:val="18"/>
+                <w:sz w:val="20"/>
               </w:rPr>
               <w:t>React + Vite</w:t>
             </w:r>
@@ -494,20 +435,14 @@
         <w:tc>
           <w:tcPr>
             <w:tcW w:type="dxa" w:w="4703"/>
-            <w:vAlign w:val="center"/>
           </w:tcPr>
           <w:p>
-            <w:pPr>
-              <w:jc w:val="left"/>
-            </w:pPr>
-            <w:r/>
             <w:r>
               <w:rPr>
                 <w:rFonts w:ascii="Arial" w:hAnsi="Arial"/>
-                <w:b w:val="0"/>
-                <w:sz w:val="18"/>
+                <w:sz w:val="20"/>
               </w:rPr>
-              <w:t>Construcci?n del frontend y empaquetado del sitio.</w:t>
+              <w:t>Frontend y empaquetado del proyecto</w:t>
             </w:r>
           </w:p>
         </w:tc>
@@ -516,18 +451,12 @@
         <w:tc>
           <w:tcPr>
             <w:tcW w:type="dxa" w:w="4703"/>
-            <w:vAlign w:val="center"/>
           </w:tcPr>
           <w:p>
-            <w:pPr>
-              <w:jc w:val="left"/>
-            </w:pPr>
-            <w:r/>
             <w:r>
               <w:rPr>
                 <w:rFonts w:ascii="Arial" w:hAnsi="Arial"/>
-                <w:b w:val="0"/>
-                <w:sz w:val="18"/>
+                <w:sz w:val="20"/>
               </w:rPr>
               <w:t>Tailwind CSS</w:t>
             </w:r>
@@ -536,20 +465,14 @@
         <w:tc>
           <w:tcPr>
             <w:tcW w:type="dxa" w:w="4703"/>
-            <w:vAlign w:val="center"/>
           </w:tcPr>
           <w:p>
-            <w:pPr>
-              <w:jc w:val="left"/>
-            </w:pPr>
-            <w:r/>
             <w:r>
               <w:rPr>
                 <w:rFonts w:ascii="Arial" w:hAnsi="Arial"/>
-                <w:b w:val="0"/>
-                <w:sz w:val="18"/>
+                <w:sz w:val="20"/>
               </w:rPr>
-              <w:t>Estilos visuales, colores, layout responsive y componentes.</w:t>
+              <w:t>Estilos y diseno responsivo</w:t>
             </w:r>
           </w:p>
         </w:tc>
@@ -558,18 +481,12 @@
         <w:tc>
           <w:tcPr>
             <w:tcW w:type="dxa" w:w="4703"/>
-            <w:vAlign w:val="center"/>
           </w:tcPr>
           <w:p>
-            <w:pPr>
-              <w:jc w:val="left"/>
-            </w:pPr>
-            <w:r/>
             <w:r>
               <w:rPr>
                 <w:rFonts w:ascii="Arial" w:hAnsi="Arial"/>
-                <w:b w:val="0"/>
-                <w:sz w:val="18"/>
+                <w:sz w:val="20"/>
               </w:rPr>
               <w:t>Node.js</w:t>
             </w:r>
@@ -578,20 +495,14 @@
         <w:tc>
           <w:tcPr>
             <w:tcW w:type="dxa" w:w="4703"/>
-            <w:vAlign w:val="center"/>
           </w:tcPr>
           <w:p>
-            <w:pPr>
-              <w:jc w:val="left"/>
-            </w:pPr>
-            <w:r/>
             <w:r>
               <w:rPr>
                 <w:rFonts w:ascii="Arial" w:hAnsi="Arial"/>
-                <w:b w:val="0"/>
-                <w:sz w:val="18"/>
+                <w:sz w:val="20"/>
               </w:rPr>
-              <w:t>Servidor backend y rutas API.</w:t>
+              <w:t>Servidor y endpoints API</w:t>
             </w:r>
           </w:p>
         </w:tc>
@@ -600,18 +511,12 @@
         <w:tc>
           <w:tcPr>
             <w:tcW w:type="dxa" w:w="4703"/>
-            <w:vAlign w:val="center"/>
           </w:tcPr>
           <w:p>
-            <w:pPr>
-              <w:jc w:val="left"/>
-            </w:pPr>
-            <w:r/>
             <w:r>
               <w:rPr>
                 <w:rFonts w:ascii="Arial" w:hAnsi="Arial"/>
-                <w:b w:val="0"/>
-                <w:sz w:val="18"/>
+                <w:sz w:val="20"/>
               </w:rPr>
               <w:t>JSON</w:t>
             </w:r>
@@ -620,20 +525,14 @@
         <w:tc>
           <w:tcPr>
             <w:tcW w:type="dxa" w:w="4703"/>
-            <w:vAlign w:val="center"/>
           </w:tcPr>
           <w:p>
-            <w:pPr>
-              <w:jc w:val="left"/>
-            </w:pPr>
-            <w:r/>
             <w:r>
               <w:rPr>
                 <w:rFonts w:ascii="Arial" w:hAnsi="Arial"/>
-                <w:b w:val="0"/>
-                <w:sz w:val="18"/>
+                <w:sz w:val="20"/>
               </w:rPr>
-              <w:t>Almacenamiento simulado para productos, usuarios y mensajes.</w:t>
+              <w:t>Almacenamiento de productos, usuarios y mensajes</w:t>
             </w:r>
           </w:p>
         </w:tc>
@@ -642,60 +541,12 @@
         <w:tc>
           <w:tcPr>
             <w:tcW w:type="dxa" w:w="4703"/>
-            <w:vAlign w:val="center"/>
           </w:tcPr>
           <w:p>
-            <w:pPr>
-              <w:jc w:val="left"/>
-            </w:pPr>
-            <w:r/>
             <w:r>
               <w:rPr>
                 <w:rFonts w:ascii="Arial" w:hAnsi="Arial"/>
-                <w:b w:val="0"/>
-                <w:sz w:val="18"/>
-              </w:rPr>
-              <w:t>HTML5 y JavaScript</w:t>
-            </w:r>
-          </w:p>
-        </w:tc>
-        <w:tc>
-          <w:tcPr>
-            <w:tcW w:type="dxa" w:w="4703"/>
-            <w:vAlign w:val="center"/>
-          </w:tcPr>
-          <w:p>
-            <w:pPr>
-              <w:jc w:val="left"/>
-            </w:pPr>
-            <w:r/>
-            <w:r>
-              <w:rPr>
-                <w:rFonts w:ascii="Arial" w:hAnsi="Arial"/>
-                <w:b w:val="0"/>
-                <w:sz w:val="18"/>
-              </w:rPr>
-              <w:t>Validaciones de formularios e interacci?n del usuario.</w:t>
-            </w:r>
-          </w:p>
-        </w:tc>
-      </w:tr>
-      <w:tr>
-        <w:tc>
-          <w:tcPr>
-            <w:tcW w:type="dxa" w:w="4703"/>
-            <w:vAlign w:val="center"/>
-          </w:tcPr>
-          <w:p>
-            <w:pPr>
-              <w:jc w:val="left"/>
-            </w:pPr>
-            <w:r/>
-            <w:r>
-              <w:rPr>
-                <w:rFonts w:ascii="Arial" w:hAnsi="Arial"/>
-                <w:b w:val="0"/>
-                <w:sz w:val="18"/>
+                <w:sz w:val="20"/>
               </w:rPr>
               <w:t>GitHub</w:t>
             </w:r>
@@ -704,20 +555,14 @@
         <w:tc>
           <w:tcPr>
             <w:tcW w:type="dxa" w:w="4703"/>
-            <w:vAlign w:val="center"/>
           </w:tcPr>
           <w:p>
-            <w:pPr>
-              <w:jc w:val="left"/>
-            </w:pPr>
-            <w:r/>
             <w:r>
               <w:rPr>
                 <w:rFonts w:ascii="Arial" w:hAnsi="Arial"/>
-                <w:b w:val="0"/>
-                <w:sz w:val="18"/>
+                <w:sz w:val="20"/>
               </w:rPr>
-              <w:t>Repositorio p?blico para la entrega y revisi?n del docente.</w:t>
+              <w:t>Entrega y publicacion del proyecto</w:t>
             </w:r>
           </w:p>
         </w:tc>
@@ -732,10 +577,9 @@
         <w:rPr>
           <w:rFonts w:ascii="Arial" w:hAnsi="Arial"/>
           <w:b/>
-          <w:color w:val="262626"/>
-          <w:sz w:val="32"/>
+          <w:sz w:val="28"/>
         </w:rPr>
-        <w:t>Estructura funcional del sitio</w:t>
+        <w:t>Requisitos cumplidos</w:t>
       </w:r>
     </w:p>
     <w:tbl>
@@ -753,44 +597,30 @@
         <w:tc>
           <w:tcPr>
             <w:tcW w:type="dxa" w:w="4703"/>
-            <w:shd w:fill="262626"/>
-            <w:vAlign w:val="center"/>
           </w:tcPr>
           <w:p>
-            <w:pPr>
-              <w:jc w:val="center"/>
-            </w:pPr>
-            <w:r/>
             <w:r>
               <w:rPr>
                 <w:rFonts w:ascii="Arial" w:hAnsi="Arial"/>
                 <w:b/>
-                <w:color w:val="FFFFFF"/>
-                <w:sz w:val="18"/>
+                <w:sz w:val="20"/>
               </w:rPr>
-              <w:t>Secci?n</w:t>
+              <w:t>Requisito</w:t>
             </w:r>
           </w:p>
         </w:tc>
         <w:tc>
           <w:tcPr>
             <w:tcW w:type="dxa" w:w="4703"/>
-            <w:shd w:fill="262626"/>
-            <w:vAlign w:val="center"/>
           </w:tcPr>
           <w:p>
-            <w:pPr>
-              <w:jc w:val="center"/>
-            </w:pPr>
-            <w:r/>
             <w:r>
               <w:rPr>
                 <w:rFonts w:ascii="Arial" w:hAnsi="Arial"/>
                 <w:b/>
-                <w:color w:val="FFFFFF"/>
-                <w:sz w:val="18"/>
+                <w:sz w:val="20"/>
               </w:rPr>
-              <w:t>Descripci?n</w:t>
+              <w:t>Estado</w:t>
             </w:r>
           </w:p>
         </w:tc>
@@ -799,40 +629,28 @@
         <w:tc>
           <w:tcPr>
             <w:tcW w:type="dxa" w:w="4703"/>
-            <w:vAlign w:val="center"/>
           </w:tcPr>
           <w:p>
-            <w:pPr>
-              <w:jc w:val="left"/>
-            </w:pPr>
-            <w:r/>
             <w:r>
               <w:rPr>
                 <w:rFonts w:ascii="Arial" w:hAnsi="Arial"/>
-                <w:b w:val="0"/>
-                <w:sz w:val="18"/>
+                <w:sz w:val="20"/>
               </w:rPr>
-              <w:t>Inicio</w:t>
+              <w:t>Mapa del sitio</w:t>
             </w:r>
           </w:p>
         </w:tc>
         <w:tc>
           <w:tcPr>
             <w:tcW w:type="dxa" w:w="4703"/>
-            <w:vAlign w:val="center"/>
           </w:tcPr>
           <w:p>
-            <w:pPr>
-              <w:jc w:val="left"/>
-            </w:pPr>
-            <w:r/>
             <w:r>
               <w:rPr>
                 <w:rFonts w:ascii="Arial" w:hAnsi="Arial"/>
-                <w:b w:val="0"/>
-                <w:sz w:val="18"/>
+                <w:sz w:val="20"/>
               </w:rPr>
-              <w:t>Presenta la identidad de Ferreter?a Valdez, slogan, categor?as y accesos principales.</w:t>
+              <w:t>Cumplido</w:t>
             </w:r>
           </w:p>
         </w:tc>
@@ -841,40 +659,28 @@
         <w:tc>
           <w:tcPr>
             <w:tcW w:type="dxa" w:w="4703"/>
-            <w:vAlign w:val="center"/>
           </w:tcPr>
           <w:p>
-            <w:pPr>
-              <w:jc w:val="left"/>
-            </w:pPr>
-            <w:r/>
             <w:r>
               <w:rPr>
                 <w:rFonts w:ascii="Arial" w:hAnsi="Arial"/>
-                <w:b w:val="0"/>
-                <w:sz w:val="18"/>
+                <w:sz w:val="20"/>
               </w:rPr>
-              <w:t>Productos</w:t>
+              <w:t>Pagina 404 personalizada</w:t>
             </w:r>
           </w:p>
         </w:tc>
         <w:tc>
           <w:tcPr>
             <w:tcW w:type="dxa" w:w="4703"/>
-            <w:vAlign w:val="center"/>
           </w:tcPr>
           <w:p>
-            <w:pPr>
-              <w:jc w:val="left"/>
-            </w:pPr>
-            <w:r/>
             <w:r>
               <w:rPr>
                 <w:rFonts w:ascii="Arial" w:hAnsi="Arial"/>
-                <w:b w:val="0"/>
-                <w:sz w:val="18"/>
+                <w:sz w:val="20"/>
               </w:rPr>
-              <w:t>Cat?logo con im?genes, nombre, marca, precio, disponibilidad, filtros y cotizaci?n por WhatsApp.</w:t>
+              <w:t>Cumplido</w:t>
             </w:r>
           </w:p>
         </w:tc>
@@ -883,40 +689,28 @@
         <w:tc>
           <w:tcPr>
             <w:tcW w:type="dxa" w:w="4703"/>
-            <w:vAlign w:val="center"/>
           </w:tcPr>
           <w:p>
-            <w:pPr>
-              <w:jc w:val="left"/>
-            </w:pPr>
-            <w:r/>
             <w:r>
               <w:rPr>
                 <w:rFonts w:ascii="Arial" w:hAnsi="Arial"/>
-                <w:b w:val="0"/>
-                <w:sz w:val="18"/>
+                <w:sz w:val="20"/>
               </w:rPr>
-              <w:t>Categor?as y Ofertas</w:t>
+              <w:t>Menu completo del sitio</w:t>
             </w:r>
           </w:p>
         </w:tc>
         <w:tc>
           <w:tcPr>
             <w:tcW w:type="dxa" w:w="4703"/>
-            <w:vAlign w:val="center"/>
           </w:tcPr>
           <w:p>
-            <w:pPr>
-              <w:jc w:val="left"/>
-            </w:pPr>
-            <w:r/>
             <w:r>
               <w:rPr>
                 <w:rFonts w:ascii="Arial" w:hAnsi="Arial"/>
-                <w:b w:val="0"/>
-                <w:sz w:val="18"/>
+                <w:sz w:val="20"/>
               </w:rPr>
-              <w:t>Permiten consultar productos organizados y promociones destacadas.</w:t>
+              <w:t>Cumplido</w:t>
             </w:r>
           </w:p>
         </w:tc>
@@ -925,40 +719,28 @@
         <w:tc>
           <w:tcPr>
             <w:tcW w:type="dxa" w:w="4703"/>
-            <w:vAlign w:val="center"/>
           </w:tcPr>
           <w:p>
-            <w:pPr>
-              <w:jc w:val="left"/>
-            </w:pPr>
-            <w:r/>
             <w:r>
               <w:rPr>
                 <w:rFonts w:ascii="Arial" w:hAnsi="Arial"/>
-                <w:b w:val="0"/>
-                <w:sz w:val="18"/>
+                <w:sz w:val="20"/>
               </w:rPr>
-              <w:t>Servicios</w:t>
+              <w:t>Busqueda de productos</w:t>
             </w:r>
           </w:p>
         </w:tc>
         <w:tc>
           <w:tcPr>
             <w:tcW w:type="dxa" w:w="4703"/>
-            <w:vAlign w:val="center"/>
           </w:tcPr>
           <w:p>
-            <w:pPr>
-              <w:jc w:val="left"/>
-            </w:pPr>
-            <w:r/>
             <w:r>
               <w:rPr>
                 <w:rFonts w:ascii="Arial" w:hAnsi="Arial"/>
-                <w:b w:val="0"/>
-                <w:sz w:val="18"/>
+                <w:sz w:val="20"/>
               </w:rPr>
-              <w:t>Describe asesor?a t?cnica, entregas, garant?as y apoyo para contratistas.</w:t>
+              <w:t>Cumplido</w:t>
             </w:r>
           </w:p>
         </w:tc>
@@ -967,40 +749,28 @@
         <w:tc>
           <w:tcPr>
             <w:tcW w:type="dxa" w:w="4703"/>
-            <w:vAlign w:val="center"/>
           </w:tcPr>
           <w:p>
-            <w:pPr>
-              <w:jc w:val="left"/>
-            </w:pPr>
-            <w:r/>
             <w:r>
               <w:rPr>
                 <w:rFonts w:ascii="Arial" w:hAnsi="Arial"/>
-                <w:b w:val="0"/>
-                <w:sz w:val="18"/>
+                <w:sz w:val="20"/>
               </w:rPr>
-              <w:t>Nosotros</w:t>
+              <w:t>Catalogo con imagen, precio y disponibilidad</w:t>
             </w:r>
           </w:p>
         </w:tc>
         <w:tc>
           <w:tcPr>
             <w:tcW w:type="dxa" w:w="4703"/>
-            <w:vAlign w:val="center"/>
           </w:tcPr>
           <w:p>
-            <w:pPr>
-              <w:jc w:val="left"/>
-            </w:pPr>
-            <w:r/>
             <w:r>
               <w:rPr>
                 <w:rFonts w:ascii="Arial" w:hAnsi="Arial"/>
-                <w:b w:val="0"/>
-                <w:sz w:val="18"/>
+                <w:sz w:val="20"/>
               </w:rPr>
-              <w:t>Explica la historia ficticia de la ferreter?a fundada en 2010.</w:t>
+              <w:t>Cumplido</w:t>
             </w:r>
           </w:p>
         </w:tc>
@@ -1009,40 +779,28 @@
         <w:tc>
           <w:tcPr>
             <w:tcW w:type="dxa" w:w="4703"/>
-            <w:vAlign w:val="center"/>
           </w:tcPr>
           <w:p>
-            <w:pPr>
-              <w:jc w:val="left"/>
-            </w:pPr>
-            <w:r/>
             <w:r>
               <w:rPr>
                 <w:rFonts w:ascii="Arial" w:hAnsi="Arial"/>
-                <w:b w:val="0"/>
-                <w:sz w:val="18"/>
+                <w:sz w:val="20"/>
               </w:rPr>
-              <w:t>Ayuda</w:t>
+              <w:t>Registro, login y recuperacion</w:t>
             </w:r>
           </w:p>
         </w:tc>
         <w:tc>
           <w:tcPr>
             <w:tcW w:type="dxa" w:w="4703"/>
-            <w:vAlign w:val="center"/>
           </w:tcPr>
           <w:p>
-            <w:pPr>
-              <w:jc w:val="left"/>
-            </w:pPr>
-            <w:r/>
             <w:r>
               <w:rPr>
                 <w:rFonts w:ascii="Arial" w:hAnsi="Arial"/>
-                <w:b w:val="0"/>
-                <w:sz w:val="18"/>
+                <w:sz w:val="20"/>
               </w:rPr>
-              <w:t>Incluye preguntas frecuentes sobre horarios, env?os, pagos, WhatsApp y facturaci?n.</w:t>
+              <w:t>Cumplido</w:t>
             </w:r>
           </w:p>
         </w:tc>
@@ -1051,40 +809,28 @@
         <w:tc>
           <w:tcPr>
             <w:tcW w:type="dxa" w:w="4703"/>
-            <w:vAlign w:val="center"/>
           </w:tcPr>
           <w:p>
-            <w:pPr>
-              <w:jc w:val="left"/>
-            </w:pPr>
-            <w:r/>
             <w:r>
               <w:rPr>
                 <w:rFonts w:ascii="Arial" w:hAnsi="Arial"/>
-                <w:b w:val="0"/>
-                <w:sz w:val="18"/>
+                <w:sz w:val="20"/>
               </w:rPr>
-              <w:t>Contacto/Buz?n</w:t>
+              <w:t>Contacto y buzon</w:t>
             </w:r>
           </w:p>
         </w:tc>
         <w:tc>
           <w:tcPr>
             <w:tcW w:type="dxa" w:w="4703"/>
-            <w:vAlign w:val="center"/>
           </w:tcPr>
           <w:p>
-            <w:pPr>
-              <w:jc w:val="left"/>
-            </w:pPr>
-            <w:r/>
             <w:r>
               <w:rPr>
                 <w:rFonts w:ascii="Arial" w:hAnsi="Arial"/>
-                <w:b w:val="0"/>
-                <w:sz w:val="18"/>
+                <w:sz w:val="20"/>
               </w:rPr>
-              <w:t>Formulario validado con CAPTCHA matem?tico y mapa integrado.</w:t>
+              <w:t>Cumplido</w:t>
             </w:r>
           </w:p>
         </w:tc>
@@ -1093,40 +839,28 @@
         <w:tc>
           <w:tcPr>
             <w:tcW w:type="dxa" w:w="4703"/>
-            <w:vAlign w:val="center"/>
           </w:tcPr>
           <w:p>
-            <w:pPr>
-              <w:jc w:val="left"/>
-            </w:pPr>
-            <w:r/>
             <w:r>
               <w:rPr>
                 <w:rFonts w:ascii="Arial" w:hAnsi="Arial"/>
-                <w:b w:val="0"/>
-                <w:sz w:val="18"/>
+                <w:sz w:val="20"/>
               </w:rPr>
-              <w:t>Registro/Login/Recuperaci?n</w:t>
+              <w:t>Captcha matematico</w:t>
             </w:r>
           </w:p>
         </w:tc>
         <w:tc>
           <w:tcPr>
             <w:tcW w:type="dxa" w:w="4703"/>
-            <w:vAlign w:val="center"/>
           </w:tcPr>
           <w:p>
-            <w:pPr>
-              <w:jc w:val="left"/>
-            </w:pPr>
-            <w:r/>
             <w:r>
               <w:rPr>
                 <w:rFonts w:ascii="Arial" w:hAnsi="Arial"/>
-                <w:b w:val="0"/>
-                <w:sz w:val="18"/>
+                <w:sz w:val="20"/>
               </w:rPr>
-              <w:t>Formularios funcionales conectados al backend.</w:t>
+              <w:t>Cumplido</w:t>
             </w:r>
           </w:p>
         </w:tc>
@@ -1135,82 +869,28 @@
         <w:tc>
           <w:tcPr>
             <w:tcW w:type="dxa" w:w="4703"/>
-            <w:vAlign w:val="center"/>
           </w:tcPr>
           <w:p>
-            <w:pPr>
-              <w:jc w:val="left"/>
-            </w:pPr>
-            <w:r/>
             <w:r>
               <w:rPr>
                 <w:rFonts w:ascii="Arial" w:hAnsi="Arial"/>
-                <w:b w:val="0"/>
-                <w:sz w:val="18"/>
+                <w:sz w:val="20"/>
               </w:rPr>
-              <w:t>Mapa del sitio</w:t>
+              <w:t>Backend con JSON</w:t>
             </w:r>
           </w:p>
         </w:tc>
         <w:tc>
           <w:tcPr>
             <w:tcW w:type="dxa" w:w="4703"/>
-            <w:vAlign w:val="center"/>
           </w:tcPr>
           <w:p>
-            <w:pPr>
-              <w:jc w:val="left"/>
-            </w:pPr>
-            <w:r/>
             <w:r>
               <w:rPr>
                 <w:rFonts w:ascii="Arial" w:hAnsi="Arial"/>
-                <w:b w:val="0"/>
-                <w:sz w:val="18"/>
+                <w:sz w:val="20"/>
               </w:rPr>
-              <w:t>Vista jer?rquica de las secciones principales y secundarias.</w:t>
-            </w:r>
-          </w:p>
-        </w:tc>
-      </w:tr>
-      <w:tr>
-        <w:tc>
-          <w:tcPr>
-            <w:tcW w:type="dxa" w:w="4703"/>
-            <w:vAlign w:val="center"/>
-          </w:tcPr>
-          <w:p>
-            <w:pPr>
-              <w:jc w:val="left"/>
-            </w:pPr>
-            <w:r/>
-            <w:r>
-              <w:rPr>
-                <w:rFonts w:ascii="Arial" w:hAnsi="Arial"/>
-                <w:b w:val="0"/>
-                <w:sz w:val="18"/>
-              </w:rPr>
-              <w:t>404</w:t>
-            </w:r>
-          </w:p>
-        </w:tc>
-        <w:tc>
-          <w:tcPr>
-            <w:tcW w:type="dxa" w:w="4703"/>
-            <w:vAlign w:val="center"/>
-          </w:tcPr>
-          <w:p>
-            <w:pPr>
-              <w:jc w:val="left"/>
-            </w:pPr>
-            <w:r/>
-            <w:r>
-              <w:rPr>
-                <w:rFonts w:ascii="Arial" w:hAnsi="Arial"/>
-                <w:b w:val="0"/>
-                <w:sz w:val="18"/>
-              </w:rPr>
-              <w:t>P?gina personalizada para rutas inexistentes.</w:t>
+              <w:t>Cumplido</w:t>
             </w:r>
           </w:p>
         </w:tc>
@@ -1225,786 +905,7 @@
         <w:rPr>
           <w:rFonts w:ascii="Arial" w:hAnsi="Arial"/>
           <w:b/>
-          <w:color w:val="262626"/>
-          <w:sz w:val="32"/>
-        </w:rPr>
-        <w:t>Cumplimiento de requisitos principales</w:t>
-      </w:r>
-    </w:p>
-    <w:tbl>
-      <w:tblPr>
-        <w:tblStyle w:val="TableGrid"/>
-        <w:tblW w:type="auto" w:w="0"/>
-        <w:jc w:val="center"/>
-        <w:tblLook w:firstColumn="1" w:firstRow="1" w:lastColumn="0" w:lastRow="0" w:noHBand="0" w:noVBand="1" w:val="04A0"/>
-      </w:tblPr>
-      <w:tblGrid>
-        <w:gridCol w:w="3135"/>
-        <w:gridCol w:w="3135"/>
-        <w:gridCol w:w="3135"/>
-      </w:tblGrid>
-      <w:tr>
-        <w:tc>
-          <w:tcPr>
-            <w:tcW w:type="dxa" w:w="3135"/>
-            <w:shd w:fill="262626"/>
-            <w:vAlign w:val="center"/>
-          </w:tcPr>
-          <w:p>
-            <w:pPr>
-              <w:jc w:val="center"/>
-            </w:pPr>
-            <w:r/>
-            <w:r>
-              <w:rPr>
-                <w:rFonts w:ascii="Arial" w:hAnsi="Arial"/>
-                <w:b/>
-                <w:color w:val="FFFFFF"/>
-                <w:sz w:val="18"/>
-              </w:rPr>
-              <w:t>Requisito</w:t>
-            </w:r>
-          </w:p>
-        </w:tc>
-        <w:tc>
-          <w:tcPr>
-            <w:tcW w:type="dxa" w:w="3135"/>
-            <w:shd w:fill="262626"/>
-            <w:vAlign w:val="center"/>
-          </w:tcPr>
-          <w:p>
-            <w:pPr>
-              <w:jc w:val="center"/>
-            </w:pPr>
-            <w:r/>
-            <w:r>
-              <w:rPr>
-                <w:rFonts w:ascii="Arial" w:hAnsi="Arial"/>
-                <w:b/>
-                <w:color w:val="FFFFFF"/>
-                <w:sz w:val="18"/>
-              </w:rPr>
-              <w:t>Estado</w:t>
-            </w:r>
-          </w:p>
-        </w:tc>
-        <w:tc>
-          <w:tcPr>
-            <w:tcW w:type="dxa" w:w="3135"/>
-            <w:shd w:fill="262626"/>
-            <w:vAlign w:val="center"/>
-          </w:tcPr>
-          <w:p>
-            <w:pPr>
-              <w:jc w:val="center"/>
-            </w:pPr>
-            <w:r/>
-            <w:r>
-              <w:rPr>
-                <w:rFonts w:ascii="Arial" w:hAnsi="Arial"/>
-                <w:b/>
-                <w:color w:val="FFFFFF"/>
-                <w:sz w:val="18"/>
-              </w:rPr>
-              <w:t>Evidencia</w:t>
-            </w:r>
-          </w:p>
-        </w:tc>
-      </w:tr>
-      <w:tr>
-        <w:tc>
-          <w:tcPr>
-            <w:tcW w:type="dxa" w:w="3135"/>
-            <w:vAlign w:val="center"/>
-          </w:tcPr>
-          <w:p>
-            <w:pPr>
-              <w:jc w:val="left"/>
-            </w:pPr>
-            <w:r/>
-            <w:r>
-              <w:rPr>
-                <w:rFonts w:ascii="Arial" w:hAnsi="Arial"/>
-                <w:b w:val="0"/>
-                <w:sz w:val="18"/>
-              </w:rPr>
-              <w:t>Mapa del sitio</w:t>
-            </w:r>
-          </w:p>
-        </w:tc>
-        <w:tc>
-          <w:tcPr>
-            <w:tcW w:type="dxa" w:w="3135"/>
-            <w:vAlign w:val="center"/>
-          </w:tcPr>
-          <w:p>
-            <w:pPr>
-              <w:jc w:val="left"/>
-            </w:pPr>
-            <w:r/>
-            <w:r>
-              <w:rPr>
-                <w:rFonts w:ascii="Arial" w:hAnsi="Arial"/>
-                <w:b w:val="0"/>
-                <w:sz w:val="18"/>
-              </w:rPr>
-              <w:t>Cumplido</w:t>
-            </w:r>
-          </w:p>
-        </w:tc>
-        <w:tc>
-          <w:tcPr>
-            <w:tcW w:type="dxa" w:w="3135"/>
-            <w:vAlign w:val="center"/>
-          </w:tcPr>
-          <w:p>
-            <w:pPr>
-              <w:jc w:val="left"/>
-            </w:pPr>
-            <w:r/>
-            <w:r>
-              <w:rPr>
-                <w:rFonts w:ascii="Arial" w:hAnsi="Arial"/>
-                <w:b w:val="0"/>
-                <w:sz w:val="18"/>
-              </w:rPr>
-              <w:t>Existe una p?gina Sitemap con grupos de navegaci?n.</w:t>
-            </w:r>
-          </w:p>
-        </w:tc>
-      </w:tr>
-      <w:tr>
-        <w:tc>
-          <w:tcPr>
-            <w:tcW w:type="dxa" w:w="3135"/>
-            <w:vAlign w:val="center"/>
-          </w:tcPr>
-          <w:p>
-            <w:pPr>
-              <w:jc w:val="left"/>
-            </w:pPr>
-            <w:r/>
-            <w:r>
-              <w:rPr>
-                <w:rFonts w:ascii="Arial" w:hAnsi="Arial"/>
-                <w:b w:val="0"/>
-                <w:sz w:val="18"/>
-              </w:rPr>
-              <w:t>P?gina 404</w:t>
-            </w:r>
-          </w:p>
-        </w:tc>
-        <w:tc>
-          <w:tcPr>
-            <w:tcW w:type="dxa" w:w="3135"/>
-            <w:vAlign w:val="center"/>
-          </w:tcPr>
-          <w:p>
-            <w:pPr>
-              <w:jc w:val="left"/>
-            </w:pPr>
-            <w:r/>
-            <w:r>
-              <w:rPr>
-                <w:rFonts w:ascii="Arial" w:hAnsi="Arial"/>
-                <w:b w:val="0"/>
-                <w:sz w:val="18"/>
-              </w:rPr>
-              <w:t>Cumplido</w:t>
-            </w:r>
-          </w:p>
-        </w:tc>
-        <w:tc>
-          <w:tcPr>
-            <w:tcW w:type="dxa" w:w="3135"/>
-            <w:vAlign w:val="center"/>
-          </w:tcPr>
-          <w:p>
-            <w:pPr>
-              <w:jc w:val="left"/>
-            </w:pPr>
-            <w:r/>
-            <w:r>
-              <w:rPr>
-                <w:rFonts w:ascii="Arial" w:hAnsi="Arial"/>
-                <w:b w:val="0"/>
-                <w:sz w:val="18"/>
-              </w:rPr>
-              <w:t>Rutas inexistentes muestran una p?gina personalizada.</w:t>
-            </w:r>
-          </w:p>
-        </w:tc>
-      </w:tr>
-      <w:tr>
-        <w:tc>
-          <w:tcPr>
-            <w:tcW w:type="dxa" w:w="3135"/>
-            <w:vAlign w:val="center"/>
-          </w:tcPr>
-          <w:p>
-            <w:pPr>
-              <w:jc w:val="left"/>
-            </w:pPr>
-            <w:r/>
-            <w:r>
-              <w:rPr>
-                <w:rFonts w:ascii="Arial" w:hAnsi="Arial"/>
-                <w:b w:val="0"/>
-                <w:sz w:val="18"/>
-              </w:rPr>
-              <w:t>ID del sitio</w:t>
-            </w:r>
-          </w:p>
-        </w:tc>
-        <w:tc>
-          <w:tcPr>
-            <w:tcW w:type="dxa" w:w="3135"/>
-            <w:vAlign w:val="center"/>
-          </w:tcPr>
-          <w:p>
-            <w:pPr>
-              <w:jc w:val="left"/>
-            </w:pPr>
-            <w:r/>
-            <w:r>
-              <w:rPr>
-                <w:rFonts w:ascii="Arial" w:hAnsi="Arial"/>
-                <w:b w:val="0"/>
-                <w:sz w:val="18"/>
-              </w:rPr>
-              <w:t>Cumplido</w:t>
-            </w:r>
-          </w:p>
-        </w:tc>
-        <w:tc>
-          <w:tcPr>
-            <w:tcW w:type="dxa" w:w="3135"/>
-            <w:vAlign w:val="center"/>
-          </w:tcPr>
-          <w:p>
-            <w:pPr>
-              <w:jc w:val="left"/>
-            </w:pPr>
-            <w:r/>
-            <w:r>
-              <w:rPr>
-                <w:rFonts w:ascii="Arial" w:hAnsi="Arial"/>
-                <w:b w:val="0"/>
-                <w:sz w:val="18"/>
-              </w:rPr>
-              <w:t>El encabezado muestra Ferreter?a Valdez como identidad.</w:t>
-            </w:r>
-          </w:p>
-        </w:tc>
-      </w:tr>
-      <w:tr>
-        <w:tc>
-          <w:tcPr>
-            <w:tcW w:type="dxa" w:w="3135"/>
-            <w:vAlign w:val="center"/>
-          </w:tcPr>
-          <w:p>
-            <w:pPr>
-              <w:jc w:val="left"/>
-            </w:pPr>
-            <w:r/>
-            <w:r>
-              <w:rPr>
-                <w:rFonts w:ascii="Arial" w:hAnsi="Arial"/>
-                <w:b w:val="0"/>
-                <w:sz w:val="18"/>
-              </w:rPr>
-              <w:t>Men? completo</w:t>
-            </w:r>
-          </w:p>
-        </w:tc>
-        <w:tc>
-          <w:tcPr>
-            <w:tcW w:type="dxa" w:w="3135"/>
-            <w:vAlign w:val="center"/>
-          </w:tcPr>
-          <w:p>
-            <w:pPr>
-              <w:jc w:val="left"/>
-            </w:pPr>
-            <w:r/>
-            <w:r>
-              <w:rPr>
-                <w:rFonts w:ascii="Arial" w:hAnsi="Arial"/>
-                <w:b w:val="0"/>
-                <w:sz w:val="18"/>
-              </w:rPr>
-              <w:t>Cumplido</w:t>
-            </w:r>
-          </w:p>
-        </w:tc>
-        <w:tc>
-          <w:tcPr>
-            <w:tcW w:type="dxa" w:w="3135"/>
-            <w:vAlign w:val="center"/>
-          </w:tcPr>
-          <w:p>
-            <w:pPr>
-              <w:jc w:val="left"/>
-            </w:pPr>
-            <w:r/>
-            <w:r>
-              <w:rPr>
-                <w:rFonts w:ascii="Arial" w:hAnsi="Arial"/>
-                <w:b w:val="0"/>
-                <w:sz w:val="18"/>
-              </w:rPr>
-              <w:t>Incluye Inicio, Productos, Categor?as, Ofertas, Servicios, Nosotros, Ayuda, Buz?n y Mapa.</w:t>
-            </w:r>
-          </w:p>
-        </w:tc>
-      </w:tr>
-      <w:tr>
-        <w:tc>
-          <w:tcPr>
-            <w:tcW w:type="dxa" w:w="3135"/>
-            <w:vAlign w:val="center"/>
-          </w:tcPr>
-          <w:p>
-            <w:pPr>
-              <w:jc w:val="left"/>
-            </w:pPr>
-            <w:r/>
-            <w:r>
-              <w:rPr>
-                <w:rFonts w:ascii="Arial" w:hAnsi="Arial"/>
-                <w:b w:val="0"/>
-                <w:sz w:val="18"/>
-              </w:rPr>
-              <w:t>Registro e inicio de sesi?n</w:t>
-            </w:r>
-          </w:p>
-        </w:tc>
-        <w:tc>
-          <w:tcPr>
-            <w:tcW w:type="dxa" w:w="3135"/>
-            <w:vAlign w:val="center"/>
-          </w:tcPr>
-          <w:p>
-            <w:pPr>
-              <w:jc w:val="left"/>
-            </w:pPr>
-            <w:r/>
-            <w:r>
-              <w:rPr>
-                <w:rFonts w:ascii="Arial" w:hAnsi="Arial"/>
-                <w:b w:val="0"/>
-                <w:sz w:val="18"/>
-              </w:rPr>
-              <w:t>Cumplido</w:t>
-            </w:r>
-          </w:p>
-        </w:tc>
-        <w:tc>
-          <w:tcPr>
-            <w:tcW w:type="dxa" w:w="3135"/>
-            <w:vAlign w:val="center"/>
-          </w:tcPr>
-          <w:p>
-            <w:pPr>
-              <w:jc w:val="left"/>
-            </w:pPr>
-            <w:r/>
-            <w:r>
-              <w:rPr>
-                <w:rFonts w:ascii="Arial" w:hAnsi="Arial"/>
-                <w:b w:val="0"/>
-                <w:sz w:val="18"/>
-              </w:rPr>
-              <w:t>Ambos formularios se conectan a endpoints del backend.</w:t>
-            </w:r>
-          </w:p>
-        </w:tc>
-      </w:tr>
-      <w:tr>
-        <w:tc>
-          <w:tcPr>
-            <w:tcW w:type="dxa" w:w="3135"/>
-            <w:vAlign w:val="center"/>
-          </w:tcPr>
-          <w:p>
-            <w:pPr>
-              <w:jc w:val="left"/>
-            </w:pPr>
-            <w:r/>
-            <w:r>
-              <w:rPr>
-                <w:rFonts w:ascii="Arial" w:hAnsi="Arial"/>
-                <w:b w:val="0"/>
-                <w:sz w:val="18"/>
-              </w:rPr>
-              <w:t>Recuperar contrase?a</w:t>
-            </w:r>
-          </w:p>
-        </w:tc>
-        <w:tc>
-          <w:tcPr>
-            <w:tcW w:type="dxa" w:w="3135"/>
-            <w:vAlign w:val="center"/>
-          </w:tcPr>
-          <w:p>
-            <w:pPr>
-              <w:jc w:val="left"/>
-            </w:pPr>
-            <w:r/>
-            <w:r>
-              <w:rPr>
-                <w:rFonts w:ascii="Arial" w:hAnsi="Arial"/>
-                <w:b w:val="0"/>
-                <w:sz w:val="18"/>
-              </w:rPr>
-              <w:t>Cumplido</w:t>
-            </w:r>
-          </w:p>
-        </w:tc>
-        <w:tc>
-          <w:tcPr>
-            <w:tcW w:type="dxa" w:w="3135"/>
-            <w:vAlign w:val="center"/>
-          </w:tcPr>
-          <w:p>
-            <w:pPr>
-              <w:jc w:val="left"/>
-            </w:pPr>
-            <w:r/>
-            <w:r>
-              <w:rPr>
-                <w:rFonts w:ascii="Arial" w:hAnsi="Arial"/>
-                <w:b w:val="0"/>
-                <w:sz w:val="18"/>
-              </w:rPr>
-              <w:t>Formulario funcional con validaci?n y respuesta simulada.</w:t>
-            </w:r>
-          </w:p>
-        </w:tc>
-      </w:tr>
-      <w:tr>
-        <w:tc>
-          <w:tcPr>
-            <w:tcW w:type="dxa" w:w="3135"/>
-            <w:vAlign w:val="center"/>
-          </w:tcPr>
-          <w:p>
-            <w:pPr>
-              <w:jc w:val="left"/>
-            </w:pPr>
-            <w:r/>
-            <w:r>
-              <w:rPr>
-                <w:rFonts w:ascii="Arial" w:hAnsi="Arial"/>
-                <w:b w:val="0"/>
-                <w:sz w:val="18"/>
-              </w:rPr>
-              <w:t>Buz?n/contacto</w:t>
-            </w:r>
-          </w:p>
-        </w:tc>
-        <w:tc>
-          <w:tcPr>
-            <w:tcW w:type="dxa" w:w="3135"/>
-            <w:vAlign w:val="center"/>
-          </w:tcPr>
-          <w:p>
-            <w:pPr>
-              <w:jc w:val="left"/>
-            </w:pPr>
-            <w:r/>
-            <w:r>
-              <w:rPr>
-                <w:rFonts w:ascii="Arial" w:hAnsi="Arial"/>
-                <w:b w:val="0"/>
-                <w:sz w:val="18"/>
-              </w:rPr>
-              <w:t>Cumplido</w:t>
-            </w:r>
-          </w:p>
-        </w:tc>
-        <w:tc>
-          <w:tcPr>
-            <w:tcW w:type="dxa" w:w="3135"/>
-            <w:vAlign w:val="center"/>
-          </w:tcPr>
-          <w:p>
-            <w:pPr>
-              <w:jc w:val="left"/>
-            </w:pPr>
-            <w:r/>
-            <w:r>
-              <w:rPr>
-                <w:rFonts w:ascii="Arial" w:hAnsi="Arial"/>
-                <w:b w:val="0"/>
-                <w:sz w:val="18"/>
-              </w:rPr>
-              <w:t>Formulario guarda mensajes en JSON.</w:t>
-            </w:r>
-          </w:p>
-        </w:tc>
-      </w:tr>
-      <w:tr>
-        <w:tc>
-          <w:tcPr>
-            <w:tcW w:type="dxa" w:w="3135"/>
-            <w:vAlign w:val="center"/>
-          </w:tcPr>
-          <w:p>
-            <w:pPr>
-              <w:jc w:val="left"/>
-            </w:pPr>
-            <w:r/>
-            <w:r>
-              <w:rPr>
-                <w:rFonts w:ascii="Arial" w:hAnsi="Arial"/>
-                <w:b w:val="0"/>
-                <w:sz w:val="18"/>
-              </w:rPr>
-              <w:t>CAPTCHA</w:t>
-            </w:r>
-          </w:p>
-        </w:tc>
-        <w:tc>
-          <w:tcPr>
-            <w:tcW w:type="dxa" w:w="3135"/>
-            <w:vAlign w:val="center"/>
-          </w:tcPr>
-          <w:p>
-            <w:pPr>
-              <w:jc w:val="left"/>
-            </w:pPr>
-            <w:r/>
-            <w:r>
-              <w:rPr>
-                <w:rFonts w:ascii="Arial" w:hAnsi="Arial"/>
-                <w:b w:val="0"/>
-                <w:sz w:val="18"/>
-              </w:rPr>
-              <w:t>Cumplido</w:t>
-            </w:r>
-          </w:p>
-        </w:tc>
-        <w:tc>
-          <w:tcPr>
-            <w:tcW w:type="dxa" w:w="3135"/>
-            <w:vAlign w:val="center"/>
-          </w:tcPr>
-          <w:p>
-            <w:pPr>
-              <w:jc w:val="left"/>
-            </w:pPr>
-            <w:r/>
-            <w:r>
-              <w:rPr>
-                <w:rFonts w:ascii="Arial" w:hAnsi="Arial"/>
-                <w:b w:val="0"/>
-                <w:sz w:val="18"/>
-              </w:rPr>
-              <w:t>Registro y contacto incluyen reto matem?tico.</w:t>
-            </w:r>
-          </w:p>
-        </w:tc>
-      </w:tr>
-      <w:tr>
-        <w:tc>
-          <w:tcPr>
-            <w:tcW w:type="dxa" w:w="3135"/>
-            <w:vAlign w:val="center"/>
-          </w:tcPr>
-          <w:p>
-            <w:pPr>
-              <w:jc w:val="left"/>
-            </w:pPr>
-            <w:r/>
-            <w:r>
-              <w:rPr>
-                <w:rFonts w:ascii="Arial" w:hAnsi="Arial"/>
-                <w:b w:val="0"/>
-                <w:sz w:val="18"/>
-              </w:rPr>
-              <w:t>Cat?logo</w:t>
-            </w:r>
-          </w:p>
-        </w:tc>
-        <w:tc>
-          <w:tcPr>
-            <w:tcW w:type="dxa" w:w="3135"/>
-            <w:vAlign w:val="center"/>
-          </w:tcPr>
-          <w:p>
-            <w:pPr>
-              <w:jc w:val="left"/>
-            </w:pPr>
-            <w:r/>
-            <w:r>
-              <w:rPr>
-                <w:rFonts w:ascii="Arial" w:hAnsi="Arial"/>
-                <w:b w:val="0"/>
-                <w:sz w:val="18"/>
-              </w:rPr>
-              <w:t>Cumplido</w:t>
-            </w:r>
-          </w:p>
-        </w:tc>
-        <w:tc>
-          <w:tcPr>
-            <w:tcW w:type="dxa" w:w="3135"/>
-            <w:vAlign w:val="center"/>
-          </w:tcPr>
-          <w:p>
-            <w:pPr>
-              <w:jc w:val="left"/>
-            </w:pPr>
-            <w:r/>
-            <w:r>
-              <w:rPr>
-                <w:rFonts w:ascii="Arial" w:hAnsi="Arial"/>
-                <w:b w:val="0"/>
-                <w:sz w:val="18"/>
-              </w:rPr>
-              <w:t>16 productos con imagen local, precio, descripci?n y disponibilidad.</w:t>
-            </w:r>
-          </w:p>
-        </w:tc>
-      </w:tr>
-      <w:tr>
-        <w:tc>
-          <w:tcPr>
-            <w:tcW w:type="dxa" w:w="3135"/>
-            <w:vAlign w:val="center"/>
-          </w:tcPr>
-          <w:p>
-            <w:pPr>
-              <w:jc w:val="left"/>
-            </w:pPr>
-            <w:r/>
-            <w:r>
-              <w:rPr>
-                <w:rFonts w:ascii="Arial" w:hAnsi="Arial"/>
-                <w:b w:val="0"/>
-                <w:sz w:val="18"/>
-              </w:rPr>
-              <w:t>Backend</w:t>
-            </w:r>
-          </w:p>
-        </w:tc>
-        <w:tc>
-          <w:tcPr>
-            <w:tcW w:type="dxa" w:w="3135"/>
-            <w:vAlign w:val="center"/>
-          </w:tcPr>
-          <w:p>
-            <w:pPr>
-              <w:jc w:val="left"/>
-            </w:pPr>
-            <w:r/>
-            <w:r>
-              <w:rPr>
-                <w:rFonts w:ascii="Arial" w:hAnsi="Arial"/>
-                <w:b w:val="0"/>
-                <w:sz w:val="18"/>
-              </w:rPr>
-              <w:t>Cumplido</w:t>
-            </w:r>
-          </w:p>
-        </w:tc>
-        <w:tc>
-          <w:tcPr>
-            <w:tcW w:type="dxa" w:w="3135"/>
-            <w:vAlign w:val="center"/>
-          </w:tcPr>
-          <w:p>
-            <w:pPr>
-              <w:jc w:val="left"/>
-            </w:pPr>
-            <w:r/>
-            <w:r>
-              <w:rPr>
-                <w:rFonts w:ascii="Arial" w:hAnsi="Arial"/>
-                <w:b w:val="0"/>
-                <w:sz w:val="18"/>
-              </w:rPr>
-              <w:t>API en Node.js con almacenamiento JSON.</w:t>
-            </w:r>
-          </w:p>
-        </w:tc>
-      </w:tr>
-      <w:tr>
-        <w:tc>
-          <w:tcPr>
-            <w:tcW w:type="dxa" w:w="3135"/>
-            <w:vAlign w:val="center"/>
-          </w:tcPr>
-          <w:p>
-            <w:pPr>
-              <w:jc w:val="left"/>
-            </w:pPr>
-            <w:r/>
-            <w:r>
-              <w:rPr>
-                <w:rFonts w:ascii="Arial" w:hAnsi="Arial"/>
-                <w:b w:val="0"/>
-                <w:sz w:val="18"/>
-              </w:rPr>
-              <w:t>Dise?o responsive</w:t>
-            </w:r>
-          </w:p>
-        </w:tc>
-        <w:tc>
-          <w:tcPr>
-            <w:tcW w:type="dxa" w:w="3135"/>
-            <w:vAlign w:val="center"/>
-          </w:tcPr>
-          <w:p>
-            <w:pPr>
-              <w:jc w:val="left"/>
-            </w:pPr>
-            <w:r/>
-            <w:r>
-              <w:rPr>
-                <w:rFonts w:ascii="Arial" w:hAnsi="Arial"/>
-                <w:b w:val="0"/>
-                <w:sz w:val="18"/>
-              </w:rPr>
-              <w:t>Cumplido</w:t>
-            </w:r>
-          </w:p>
-        </w:tc>
-        <w:tc>
-          <w:tcPr>
-            <w:tcW w:type="dxa" w:w="3135"/>
-            <w:vAlign w:val="center"/>
-          </w:tcPr>
-          <w:p>
-            <w:pPr>
-              <w:jc w:val="left"/>
-            </w:pPr>
-            <w:r/>
-            <w:r>
-              <w:rPr>
-                <w:rFonts w:ascii="Arial" w:hAnsi="Arial"/>
-                <w:b w:val="0"/>
-                <w:sz w:val="18"/>
-              </w:rPr>
-              <w:t>Interfaz adaptada con Tailwind CSS y componentes responsivos.</w:t>
-            </w:r>
-          </w:p>
-        </w:tc>
-      </w:tr>
-    </w:tbl>
-    <w:p/>
-    <w:p>
-      <w:pPr>
-        <w:spacing w:before="200" w:after="120"/>
-      </w:pPr>
-      <w:r>
-        <w:rPr>
-          <w:rFonts w:ascii="Arial" w:hAnsi="Arial"/>
-          <w:b/>
-          <w:color w:val="262626"/>
-          <w:sz w:val="32"/>
+          <w:sz w:val="28"/>
         </w:rPr>
         <w:t>Evidencia del backend</w:t>
       </w:r>
@@ -2017,72 +918,67 @@
         <w:tblLook w:firstColumn="1" w:firstRow="1" w:lastColumn="0" w:lastRow="0" w:noHBand="0" w:noVBand="1" w:val="04A0"/>
       </w:tblPr>
       <w:tblGrid>
-        <w:gridCol w:w="3135"/>
-        <w:gridCol w:w="3135"/>
-        <w:gridCol w:w="3135"/>
+        <w:gridCol w:w="2351"/>
+        <w:gridCol w:w="2351"/>
+        <w:gridCol w:w="2351"/>
+        <w:gridCol w:w="2351"/>
       </w:tblGrid>
       <w:tr>
         <w:tc>
           <w:tcPr>
-            <w:tcW w:type="dxa" w:w="3135"/>
-            <w:shd w:fill="262626"/>
-            <w:vAlign w:val="center"/>
+            <w:tcW w:type="dxa" w:w="2351"/>
           </w:tcPr>
           <w:p>
-            <w:pPr>
-              <w:jc w:val="center"/>
-            </w:pPr>
-            <w:r/>
             <w:r>
               <w:rPr>
                 <w:rFonts w:ascii="Arial" w:hAnsi="Arial"/>
                 <w:b/>
-                <w:color w:val="FFFFFF"/>
-                <w:sz w:val="18"/>
+                <w:sz w:val="20"/>
               </w:rPr>
-              <w:t>Endpoint</w:t>
+              <w:t>Metodo</w:t>
             </w:r>
           </w:p>
         </w:tc>
         <w:tc>
           <w:tcPr>
-            <w:tcW w:type="dxa" w:w="3135"/>
-            <w:shd w:fill="262626"/>
-            <w:vAlign w:val="center"/>
+            <w:tcW w:type="dxa" w:w="2351"/>
           </w:tcPr>
           <w:p>
-            <w:pPr>
-              <w:jc w:val="center"/>
-            </w:pPr>
-            <w:r/>
             <w:r>
               <w:rPr>
                 <w:rFonts w:ascii="Arial" w:hAnsi="Arial"/>
                 <w:b/>
-                <w:color w:val="FFFFFF"/>
-                <w:sz w:val="18"/>
+                <w:sz w:val="20"/>
               </w:rPr>
-              <w:t>C?digo</w:t>
+              <w:t>Ruta</w:t>
             </w:r>
           </w:p>
         </w:tc>
         <w:tc>
           <w:tcPr>
-            <w:tcW w:type="dxa" w:w="3135"/>
-            <w:shd w:fill="262626"/>
-            <w:vAlign w:val="center"/>
+            <w:tcW w:type="dxa" w:w="2351"/>
           </w:tcPr>
           <w:p>
-            <w:pPr>
-              <w:jc w:val="center"/>
-            </w:pPr>
-            <w:r/>
             <w:r>
               <w:rPr>
                 <w:rFonts w:ascii="Arial" w:hAnsi="Arial"/>
                 <w:b/>
-                <w:color w:val="FFFFFF"/>
-                <w:sz w:val="18"/>
+                <w:sz w:val="20"/>
+              </w:rPr>
+              <w:t>Codigo</w:t>
+            </w:r>
+          </w:p>
+        </w:tc>
+        <w:tc>
+          <w:tcPr>
+            <w:tcW w:type="dxa" w:w="2351"/>
+          </w:tcPr>
+          <w:p>
+            <w:r>
+              <w:rPr>
+                <w:rFonts w:ascii="Arial" w:hAnsi="Arial"/>
+                <w:b/>
+                <w:sz w:val="20"/>
               </w:rPr>
               <w:t>Resultado</w:t>
             </w:r>
@@ -2092,39 +988,41 @@
       <w:tr>
         <w:tc>
           <w:tcPr>
-            <w:tcW w:type="dxa" w:w="3135"/>
-            <w:vAlign w:val="center"/>
+            <w:tcW w:type="dxa" w:w="2351"/>
           </w:tcPr>
           <w:p>
-            <w:pPr>
-              <w:jc w:val="left"/>
-            </w:pPr>
-            <w:r/>
             <w:r>
               <w:rPr>
                 <w:rFonts w:ascii="Arial" w:hAnsi="Arial"/>
-                <w:b w:val="0"/>
-                <w:sz w:val="18"/>
+                <w:sz w:val="20"/>
               </w:rPr>
-              <w:t>GET /api/products</w:t>
+              <w:t>GET</w:t>
             </w:r>
           </w:p>
         </w:tc>
         <w:tc>
           <w:tcPr>
-            <w:tcW w:type="dxa" w:w="3135"/>
-            <w:vAlign w:val="center"/>
+            <w:tcW w:type="dxa" w:w="2351"/>
           </w:tcPr>
           <w:p>
-            <w:pPr>
-              <w:jc w:val="left"/>
-            </w:pPr>
-            <w:r/>
             <w:r>
               <w:rPr>
                 <w:rFonts w:ascii="Arial" w:hAnsi="Arial"/>
-                <w:b w:val="0"/>
-                <w:sz w:val="18"/>
+                <w:sz w:val="20"/>
+              </w:rPr>
+              <w:t>/api/products</w:t>
+            </w:r>
+          </w:p>
+        </w:tc>
+        <w:tc>
+          <w:tcPr>
+            <w:tcW w:type="dxa" w:w="2351"/>
+          </w:tcPr>
+          <w:p>
+            <w:r>
+              <w:rPr>
+                <w:rFonts w:ascii="Arial" w:hAnsi="Arial"/>
+                <w:sz w:val="20"/>
               </w:rPr>
               <w:t>200</w:t>
             </w:r>
@@ -2132,19 +1030,13 @@
         </w:tc>
         <w:tc>
           <w:tcPr>
-            <w:tcW w:type="dxa" w:w="3135"/>
-            <w:vAlign w:val="center"/>
+            <w:tcW w:type="dxa" w:w="2351"/>
           </w:tcPr>
           <w:p>
-            <w:pPr>
-              <w:jc w:val="left"/>
-            </w:pPr>
-            <w:r/>
             <w:r>
               <w:rPr>
                 <w:rFonts w:ascii="Arial" w:hAnsi="Arial"/>
-                <w:b w:val="0"/>
-                <w:sz w:val="18"/>
+                <w:sz w:val="20"/>
               </w:rPr>
               <w:t>16 productos</w:t>
             </w:r>
@@ -2154,39 +1046,41 @@
       <w:tr>
         <w:tc>
           <w:tcPr>
-            <w:tcW w:type="dxa" w:w="3135"/>
-            <w:vAlign w:val="center"/>
+            <w:tcW w:type="dxa" w:w="2351"/>
           </w:tcPr>
           <w:p>
-            <w:pPr>
-              <w:jc w:val="left"/>
-            </w:pPr>
-            <w:r/>
             <w:r>
               <w:rPr>
                 <w:rFonts w:ascii="Arial" w:hAnsi="Arial"/>
-                <w:b w:val="0"/>
-                <w:sz w:val="18"/>
+                <w:sz w:val="20"/>
               </w:rPr>
-              <w:t>POST /api/register</w:t>
+              <w:t>POST</w:t>
             </w:r>
           </w:p>
         </w:tc>
         <w:tc>
           <w:tcPr>
-            <w:tcW w:type="dxa" w:w="3135"/>
-            <w:vAlign w:val="center"/>
+            <w:tcW w:type="dxa" w:w="2351"/>
           </w:tcPr>
           <w:p>
-            <w:pPr>
-              <w:jc w:val="left"/>
-            </w:pPr>
-            <w:r/>
             <w:r>
               <w:rPr>
                 <w:rFonts w:ascii="Arial" w:hAnsi="Arial"/>
-                <w:b w:val="0"/>
-                <w:sz w:val="18"/>
+                <w:sz w:val="20"/>
+              </w:rPr>
+              <w:t>/api/register</w:t>
+            </w:r>
+          </w:p>
+        </w:tc>
+        <w:tc>
+          <w:tcPr>
+            <w:tcW w:type="dxa" w:w="2351"/>
+          </w:tcPr>
+          <w:p>
+            <w:r>
+              <w:rPr>
+                <w:rFonts w:ascii="Arial" w:hAnsi="Arial"/>
+                <w:sz w:val="20"/>
               </w:rPr>
               <w:t>200</w:t>
             </w:r>
@@ -2194,19 +1088,13 @@
         </w:tc>
         <w:tc>
           <w:tcPr>
-            <w:tcW w:type="dxa" w:w="3135"/>
-            <w:vAlign w:val="center"/>
+            <w:tcW w:type="dxa" w:w="2351"/>
           </w:tcPr>
           <w:p>
-            <w:pPr>
-              <w:jc w:val="left"/>
-            </w:pPr>
-            <w:r/>
             <w:r>
               <w:rPr>
                 <w:rFonts w:ascii="Arial" w:hAnsi="Arial"/>
-                <w:b w:val="0"/>
-                <w:sz w:val="18"/>
+                <w:sz w:val="20"/>
               </w:rPr>
               <w:t>Registro exitoso</w:t>
             </w:r>
@@ -2216,39 +1104,41 @@
       <w:tr>
         <w:tc>
           <w:tcPr>
-            <w:tcW w:type="dxa" w:w="3135"/>
-            <w:vAlign w:val="center"/>
+            <w:tcW w:type="dxa" w:w="2351"/>
           </w:tcPr>
           <w:p>
-            <w:pPr>
-              <w:jc w:val="left"/>
-            </w:pPr>
-            <w:r/>
             <w:r>
               <w:rPr>
                 <w:rFonts w:ascii="Arial" w:hAnsi="Arial"/>
-                <w:b w:val="0"/>
-                <w:sz w:val="18"/>
+                <w:sz w:val="20"/>
               </w:rPr>
-              <w:t>POST /api/login</w:t>
+              <w:t>POST</w:t>
             </w:r>
           </w:p>
         </w:tc>
         <w:tc>
           <w:tcPr>
-            <w:tcW w:type="dxa" w:w="3135"/>
-            <w:vAlign w:val="center"/>
+            <w:tcW w:type="dxa" w:w="2351"/>
           </w:tcPr>
           <w:p>
-            <w:pPr>
-              <w:jc w:val="left"/>
-            </w:pPr>
-            <w:r/>
             <w:r>
               <w:rPr>
                 <w:rFonts w:ascii="Arial" w:hAnsi="Arial"/>
-                <w:b w:val="0"/>
-                <w:sz w:val="18"/>
+                <w:sz w:val="20"/>
+              </w:rPr>
+              <w:t>/api/login</w:t>
+            </w:r>
+          </w:p>
+        </w:tc>
+        <w:tc>
+          <w:tcPr>
+            <w:tcW w:type="dxa" w:w="2351"/>
+          </w:tcPr>
+          <w:p>
+            <w:r>
+              <w:rPr>
+                <w:rFonts w:ascii="Arial" w:hAnsi="Arial"/>
+                <w:sz w:val="20"/>
               </w:rPr>
               <w:t>200</w:t>
             </w:r>
@@ -2256,19 +1146,13 @@
         </w:tc>
         <w:tc>
           <w:tcPr>
-            <w:tcW w:type="dxa" w:w="3135"/>
-            <w:vAlign w:val="center"/>
+            <w:tcW w:type="dxa" w:w="2351"/>
           </w:tcPr>
           <w:p>
-            <w:pPr>
-              <w:jc w:val="left"/>
-            </w:pPr>
-            <w:r/>
             <w:r>
               <w:rPr>
                 <w:rFonts w:ascii="Arial" w:hAnsi="Arial"/>
-                <w:b w:val="0"/>
-                <w:sz w:val="18"/>
+                <w:sz w:val="20"/>
               </w:rPr>
               <w:t>Inicio de sesión correcto</w:t>
             </w:r>
@@ -2278,39 +1162,41 @@
       <w:tr>
         <w:tc>
           <w:tcPr>
-            <w:tcW w:type="dxa" w:w="3135"/>
-            <w:vAlign w:val="center"/>
+            <w:tcW w:type="dxa" w:w="2351"/>
           </w:tcPr>
           <w:p>
-            <w:pPr>
-              <w:jc w:val="left"/>
-            </w:pPr>
-            <w:r/>
             <w:r>
               <w:rPr>
                 <w:rFonts w:ascii="Arial" w:hAnsi="Arial"/>
-                <w:b w:val="0"/>
-                <w:sz w:val="18"/>
+                <w:sz w:val="20"/>
               </w:rPr>
-              <w:t>POST /api/contact</w:t>
+              <w:t>POST</w:t>
             </w:r>
           </w:p>
         </w:tc>
         <w:tc>
           <w:tcPr>
-            <w:tcW w:type="dxa" w:w="3135"/>
-            <w:vAlign w:val="center"/>
+            <w:tcW w:type="dxa" w:w="2351"/>
           </w:tcPr>
           <w:p>
-            <w:pPr>
-              <w:jc w:val="left"/>
-            </w:pPr>
-            <w:r/>
             <w:r>
               <w:rPr>
                 <w:rFonts w:ascii="Arial" w:hAnsi="Arial"/>
-                <w:b w:val="0"/>
-                <w:sz w:val="18"/>
+                <w:sz w:val="20"/>
+              </w:rPr>
+              <w:t>/api/contact</w:t>
+            </w:r>
+          </w:p>
+        </w:tc>
+        <w:tc>
+          <w:tcPr>
+            <w:tcW w:type="dxa" w:w="2351"/>
+          </w:tcPr>
+          <w:p>
+            <w:r>
+              <w:rPr>
+                <w:rFonts w:ascii="Arial" w:hAnsi="Arial"/>
+                <w:sz w:val="20"/>
               </w:rPr>
               <w:t>200</w:t>
             </w:r>
@@ -2318,19 +1204,13 @@
         </w:tc>
         <w:tc>
           <w:tcPr>
-            <w:tcW w:type="dxa" w:w="3135"/>
-            <w:vAlign w:val="center"/>
+            <w:tcW w:type="dxa" w:w="2351"/>
           </w:tcPr>
           <w:p>
-            <w:pPr>
-              <w:jc w:val="left"/>
-            </w:pPr>
-            <w:r/>
             <w:r>
               <w:rPr>
                 <w:rFonts w:ascii="Arial" w:hAnsi="Arial"/>
-                <w:b w:val="0"/>
-                <w:sz w:val="18"/>
+                <w:sz w:val="20"/>
               </w:rPr>
               <w:t>Mensaje enviado</w:t>
             </w:r>
@@ -2340,39 +1220,41 @@
       <w:tr>
         <w:tc>
           <w:tcPr>
-            <w:tcW w:type="dxa" w:w="3135"/>
-            <w:vAlign w:val="center"/>
+            <w:tcW w:type="dxa" w:w="2351"/>
           </w:tcPr>
           <w:p>
-            <w:pPr>
-              <w:jc w:val="left"/>
-            </w:pPr>
-            <w:r/>
             <w:r>
               <w:rPr>
                 <w:rFonts w:ascii="Arial" w:hAnsi="Arial"/>
-                <w:b w:val="0"/>
-                <w:sz w:val="18"/>
+                <w:sz w:val="20"/>
               </w:rPr>
-              <w:t>POST /api/recover</w:t>
+              <w:t>POST</w:t>
             </w:r>
           </w:p>
         </w:tc>
         <w:tc>
           <w:tcPr>
-            <w:tcW w:type="dxa" w:w="3135"/>
-            <w:vAlign w:val="center"/>
+            <w:tcW w:type="dxa" w:w="2351"/>
           </w:tcPr>
           <w:p>
-            <w:pPr>
-              <w:jc w:val="left"/>
-            </w:pPr>
-            <w:r/>
             <w:r>
               <w:rPr>
                 <w:rFonts w:ascii="Arial" w:hAnsi="Arial"/>
-                <w:b w:val="0"/>
-                <w:sz w:val="18"/>
+                <w:sz w:val="20"/>
+              </w:rPr>
+              <w:t>/api/recover</w:t>
+            </w:r>
+          </w:p>
+        </w:tc>
+        <w:tc>
+          <w:tcPr>
+            <w:tcW w:type="dxa" w:w="2351"/>
+          </w:tcPr>
+          <w:p>
+            <w:r>
+              <w:rPr>
+                <w:rFonts w:ascii="Arial" w:hAnsi="Arial"/>
+                <w:sz w:val="20"/>
               </w:rPr>
               <w:t>200</w:t>
             </w:r>
@@ -2380,19 +1262,13 @@
         </w:tc>
         <w:tc>
           <w:tcPr>
-            <w:tcW w:type="dxa" w:w="3135"/>
-            <w:vAlign w:val="center"/>
+            <w:tcW w:type="dxa" w:w="2351"/>
           </w:tcPr>
           <w:p>
-            <w:pPr>
-              <w:jc w:val="left"/>
-            </w:pPr>
-            <w:r/>
             <w:r>
               <w:rPr>
                 <w:rFonts w:ascii="Arial" w:hAnsi="Arial"/>
-                <w:b w:val="0"/>
-                <w:sz w:val="18"/>
+                <w:sz w:val="20"/>
               </w:rPr>
               <w:t>Se ha enviado un correo para restablecer la contraseña (simulado)</w:t>
             </w:r>
@@ -2402,17 +1278,23 @@
     </w:tbl>
     <w:p/>
     <w:p>
-      <w:pPr>
-        <w:spacing w:line="360" w:lineRule="auto" w:after="120"/>
-        <w:jc w:val="both"/>
-      </w:pPr>
       <w:r>
         <w:rPr>
           <w:rFonts w:ascii="Arial" w:hAnsi="Arial"/>
           <w:b w:val="0"/>
           <w:sz w:val="24"/>
         </w:rPr>
-        <w:t>Adem?s, se ejecutaron las comprobaciones npm run build y npm run lint, ambas con resultado correcto.</w:t>
+        <w:t>npm run build: correcto</w:t>
+      </w:r>
+    </w:p>
+    <w:p>
+      <w:r>
+        <w:rPr>
+          <w:rFonts w:ascii="Arial" w:hAnsi="Arial"/>
+          <w:b w:val="0"/>
+          <w:sz w:val="24"/>
+        </w:rPr>
+        <w:t>npm run lint: correcto</w:t>
       </w:r>
     </w:p>
     <w:p>
@@ -2423,31 +1305,29 @@
         <w:rPr>
           <w:rFonts w:ascii="Arial" w:hAnsi="Arial"/>
           <w:b/>
-          <w:color w:val="262626"/>
-          <w:sz w:val="32"/>
+          <w:sz w:val="28"/>
         </w:rPr>
-        <w:t>Capturas de pantalla del sitio</w:t>
+        <w:t>Capturas del sitio</w:t>
       </w:r>
     </w:p>
     <w:p>
       <w:pPr>
-        <w:spacing w:before="120" w:after="120"/>
+        <w:spacing w:before="200" w:after="120"/>
       </w:pPr>
       <w:r>
         <w:rPr>
           <w:rFonts w:ascii="Arial" w:hAnsi="Arial"/>
           <w:b/>
-          <w:color w:val="262626"/>
-          <w:sz w:val="26"/>
+          <w:sz w:val="24"/>
         </w:rPr>
-        <w:t>Figura 1. P?gina de inicio con identidad visual, slogan y accesos al cat?logo.</w:t>
+        <w:t>Pagina de inicio</w:t>
       </w:r>
     </w:p>
     <w:p>
       <w:r>
         <w:drawing>
           <wp:inline xmlns:a="http://schemas.openxmlformats.org/drawingml/2006/main" xmlns:pic="http://schemas.openxmlformats.org/drawingml/2006/picture">
-            <wp:extent cx="5897880" cy="3885865"/>
+            <wp:extent cx="5577840" cy="3675004"/>
             <wp:docPr id="1" name="Picture 1"/>
             <wp:cNvGraphicFramePr>
               <a:graphicFrameLocks noChangeAspect="1"/>
@@ -2468,7 +1348,7 @@
                   <pic:spPr>
                     <a:xfrm>
                       <a:off x="0" y="0"/>
-                      <a:ext cx="5897880" cy="3885865"/>
+                      <a:ext cx="5577840" cy="3675004"/>
                     </a:xfrm>
                     <a:prstGeom prst="rect"/>
                   </pic:spPr>
@@ -2481,42 +1361,35 @@
     </w:p>
     <w:p>
       <w:pPr>
-        <w:spacing w:line="360" w:lineRule="auto" w:after="120"/>
-        <w:jc w:val="both"/>
+        <w:jc w:val="center"/>
       </w:pPr>
       <w:r>
         <w:rPr>
           <w:rFonts w:ascii="Arial" w:hAnsi="Arial"/>
-          <w:b w:val="0"/>
+          <w:i/>
           <w:sz w:val="20"/>
         </w:rPr>
-        <w:t>P?gina de inicio con identidad visual, slogan y accesos al cat?logo.</w:t>
-      </w:r>
-    </w:p>
-    <w:p>
-      <w:r>
-        <w:br w:type="page"/>
+        <w:t>Pagina de inicio</w:t>
       </w:r>
     </w:p>
     <w:p>
       <w:pPr>
-        <w:spacing w:before="120" w:after="120"/>
+        <w:spacing w:before="200" w:after="120"/>
       </w:pPr>
       <w:r>
         <w:rPr>
           <w:rFonts w:ascii="Arial" w:hAnsi="Arial"/>
           <w:b/>
-          <w:color w:val="262626"/>
-          <w:sz w:val="26"/>
+          <w:sz w:val="24"/>
         </w:rPr>
-        <w:t>Figura 2. Cat?logo de productos con filtros, precios, disponibilidad e im?genes locales.</w:t>
+        <w:t>Catalogo de productos</w:t>
       </w:r>
     </w:p>
     <w:p>
       <w:r>
         <w:drawing>
           <wp:inline xmlns:a="http://schemas.openxmlformats.org/drawingml/2006/main" xmlns:pic="http://schemas.openxmlformats.org/drawingml/2006/picture">
-            <wp:extent cx="5897880" cy="3885865"/>
+            <wp:extent cx="5577840" cy="3675004"/>
             <wp:docPr id="2" name="Picture 2"/>
             <wp:cNvGraphicFramePr>
               <a:graphicFrameLocks noChangeAspect="1"/>
@@ -2537,7 +1410,7 @@
                   <pic:spPr>
                     <a:xfrm>
                       <a:off x="0" y="0"/>
-                      <a:ext cx="5897880" cy="3885865"/>
+                      <a:ext cx="5577840" cy="3675004"/>
                     </a:xfrm>
                     <a:prstGeom prst="rect"/>
                   </pic:spPr>
@@ -2550,42 +1423,35 @@
     </w:p>
     <w:p>
       <w:pPr>
-        <w:spacing w:line="360" w:lineRule="auto" w:after="120"/>
-        <w:jc w:val="both"/>
+        <w:jc w:val="center"/>
       </w:pPr>
       <w:r>
         <w:rPr>
           <w:rFonts w:ascii="Arial" w:hAnsi="Arial"/>
-          <w:b w:val="0"/>
+          <w:i/>
           <w:sz w:val="20"/>
         </w:rPr>
-        <w:t>Cat?logo de productos con filtros, precios, disponibilidad e im?genes locales.</w:t>
-      </w:r>
-    </w:p>
-    <w:p>
-      <w:r>
-        <w:br w:type="page"/>
+        <w:t>Catalogo de productos</w:t>
       </w:r>
     </w:p>
     <w:p>
       <w:pPr>
-        <w:spacing w:before="120" w:after="120"/>
+        <w:spacing w:before="200" w:after="120"/>
       </w:pPr>
       <w:r>
         <w:rPr>
           <w:rFonts w:ascii="Arial" w:hAnsi="Arial"/>
           <w:b/>
-          <w:color w:val="262626"/>
-          <w:sz w:val="26"/>
+          <w:sz w:val="24"/>
         </w:rPr>
-        <w:t>Figura 3. Buz?n de mensajes con datos de contacto, mapa integrado y verificaci?n humana.</w:t>
+        <w:t>Contacto y buzon</w:t>
       </w:r>
     </w:p>
     <w:p>
       <w:r>
         <w:drawing>
           <wp:inline xmlns:a="http://schemas.openxmlformats.org/drawingml/2006/main" xmlns:pic="http://schemas.openxmlformats.org/drawingml/2006/picture">
-            <wp:extent cx="5897880" cy="3885865"/>
+            <wp:extent cx="5577840" cy="3675004"/>
             <wp:docPr id="3" name="Picture 3"/>
             <wp:cNvGraphicFramePr>
               <a:graphicFrameLocks noChangeAspect="1"/>
@@ -2606,7 +1472,7 @@
                   <pic:spPr>
                     <a:xfrm>
                       <a:off x="0" y="0"/>
-                      <a:ext cx="5897880" cy="3885865"/>
+                      <a:ext cx="5577840" cy="3675004"/>
                     </a:xfrm>
                     <a:prstGeom prst="rect"/>
                   </pic:spPr>
@@ -2619,42 +1485,35 @@
     </w:p>
     <w:p>
       <w:pPr>
-        <w:spacing w:line="360" w:lineRule="auto" w:after="120"/>
-        <w:jc w:val="both"/>
+        <w:jc w:val="center"/>
       </w:pPr>
       <w:r>
         <w:rPr>
           <w:rFonts w:ascii="Arial" w:hAnsi="Arial"/>
-          <w:b w:val="0"/>
+          <w:i/>
           <w:sz w:val="20"/>
         </w:rPr>
-        <w:t>Buz?n de mensajes con datos de contacto, mapa integrado y verificaci?n humana.</w:t>
-      </w:r>
-    </w:p>
-    <w:p>
-      <w:r>
-        <w:br w:type="page"/>
+        <w:t>Contacto y buzon</w:t>
       </w:r>
     </w:p>
     <w:p>
       <w:pPr>
-        <w:spacing w:before="120" w:after="120"/>
+        <w:spacing w:before="200" w:after="120"/>
       </w:pPr>
       <w:r>
         <w:rPr>
           <w:rFonts w:ascii="Arial" w:hAnsi="Arial"/>
           <w:b/>
-          <w:color w:val="262626"/>
-          <w:sz w:val="26"/>
+          <w:sz w:val="24"/>
         </w:rPr>
-        <w:t>Figura 4. Formulario de registro con validaci?n y CAPTCHA matem?tico.</w:t>
+        <w:t>Registro de usuario</w:t>
       </w:r>
     </w:p>
     <w:p>
       <w:r>
         <w:drawing>
           <wp:inline xmlns:a="http://schemas.openxmlformats.org/drawingml/2006/main" xmlns:pic="http://schemas.openxmlformats.org/drawingml/2006/picture">
-            <wp:extent cx="5897880" cy="3885865"/>
+            <wp:extent cx="5577840" cy="3675004"/>
             <wp:docPr id="4" name="Picture 4"/>
             <wp:cNvGraphicFramePr>
               <a:graphicFrameLocks noChangeAspect="1"/>
@@ -2675,7 +1534,7 @@
                   <pic:spPr>
                     <a:xfrm>
                       <a:off x="0" y="0"/>
-                      <a:ext cx="5897880" cy="3885865"/>
+                      <a:ext cx="5577840" cy="3675004"/>
                     </a:xfrm>
                     <a:prstGeom prst="rect"/>
                   </pic:spPr>
@@ -2688,42 +1547,35 @@
     </w:p>
     <w:p>
       <w:pPr>
-        <w:spacing w:line="360" w:lineRule="auto" w:after="120"/>
-        <w:jc w:val="both"/>
+        <w:jc w:val="center"/>
       </w:pPr>
       <w:r>
         <w:rPr>
           <w:rFonts w:ascii="Arial" w:hAnsi="Arial"/>
-          <w:b w:val="0"/>
+          <w:i/>
           <w:sz w:val="20"/>
         </w:rPr>
-        <w:t>Formulario de registro con validaci?n y CAPTCHA matem?tico.</w:t>
-      </w:r>
-    </w:p>
-    <w:p>
-      <w:r>
-        <w:br w:type="page"/>
+        <w:t>Registro de usuario</w:t>
       </w:r>
     </w:p>
     <w:p>
       <w:pPr>
-        <w:spacing w:before="120" w:after="120"/>
+        <w:spacing w:before="200" w:after="120"/>
       </w:pPr>
       <w:r>
         <w:rPr>
           <w:rFonts w:ascii="Arial" w:hAnsi="Arial"/>
           <w:b/>
-          <w:color w:val="262626"/>
-          <w:sz w:val="26"/>
+          <w:sz w:val="24"/>
         </w:rPr>
-        <w:t>Figura 5. Formulario de inicio de sesi?n con acceso a recuperaci?n de contrase?a.</w:t>
+        <w:t>Inicio de sesion</w:t>
       </w:r>
     </w:p>
     <w:p>
       <w:r>
         <w:drawing>
           <wp:inline xmlns:a="http://schemas.openxmlformats.org/drawingml/2006/main" xmlns:pic="http://schemas.openxmlformats.org/drawingml/2006/picture">
-            <wp:extent cx="5897880" cy="3885865"/>
+            <wp:extent cx="5577840" cy="3675004"/>
             <wp:docPr id="5" name="Picture 5"/>
             <wp:cNvGraphicFramePr>
               <a:graphicFrameLocks noChangeAspect="1"/>
@@ -2744,7 +1596,7 @@
                   <pic:spPr>
                     <a:xfrm>
                       <a:off x="0" y="0"/>
-                      <a:ext cx="5897880" cy="3885865"/>
+                      <a:ext cx="5577840" cy="3675004"/>
                     </a:xfrm>
                     <a:prstGeom prst="rect"/>
                   </pic:spPr>
@@ -2757,42 +1609,35 @@
     </w:p>
     <w:p>
       <w:pPr>
-        <w:spacing w:line="360" w:lineRule="auto" w:after="120"/>
-        <w:jc w:val="both"/>
+        <w:jc w:val="center"/>
       </w:pPr>
       <w:r>
         <w:rPr>
           <w:rFonts w:ascii="Arial" w:hAnsi="Arial"/>
-          <w:b w:val="0"/>
+          <w:i/>
           <w:sz w:val="20"/>
         </w:rPr>
-        <w:t>Formulario de inicio de sesi?n con acceso a recuperaci?n de contrase?a.</w:t>
-      </w:r>
-    </w:p>
-    <w:p>
-      <w:r>
-        <w:br w:type="page"/>
+        <w:t>Inicio de sesion</w:t>
       </w:r>
     </w:p>
     <w:p>
       <w:pPr>
-        <w:spacing w:before="120" w:after="120"/>
+        <w:spacing w:before="200" w:after="120"/>
       </w:pPr>
       <w:r>
         <w:rPr>
           <w:rFonts w:ascii="Arial" w:hAnsi="Arial"/>
           <w:b/>
-          <w:color w:val="262626"/>
-          <w:sz w:val="26"/>
+          <w:sz w:val="24"/>
         </w:rPr>
-        <w:t>Figura 6. P?gina de ayuda con preguntas frecuentes.</w:t>
+        <w:t>Ayuda y preguntas frecuentes</w:t>
       </w:r>
     </w:p>
     <w:p>
       <w:r>
         <w:drawing>
           <wp:inline xmlns:a="http://schemas.openxmlformats.org/drawingml/2006/main" xmlns:pic="http://schemas.openxmlformats.org/drawingml/2006/picture">
-            <wp:extent cx="5897880" cy="3885865"/>
+            <wp:extent cx="5577840" cy="3675004"/>
             <wp:docPr id="6" name="Picture 6"/>
             <wp:cNvGraphicFramePr>
               <a:graphicFrameLocks noChangeAspect="1"/>
@@ -2813,7 +1658,7 @@
                   <pic:spPr>
                     <a:xfrm>
                       <a:off x="0" y="0"/>
-                      <a:ext cx="5897880" cy="3885865"/>
+                      <a:ext cx="5577840" cy="3675004"/>
                     </a:xfrm>
                     <a:prstGeom prst="rect"/>
                   </pic:spPr>
@@ -2826,42 +1671,35 @@
     </w:p>
     <w:p>
       <w:pPr>
-        <w:spacing w:line="360" w:lineRule="auto" w:after="120"/>
-        <w:jc w:val="both"/>
+        <w:jc w:val="center"/>
       </w:pPr>
       <w:r>
         <w:rPr>
           <w:rFonts w:ascii="Arial" w:hAnsi="Arial"/>
-          <w:b w:val="0"/>
+          <w:i/>
           <w:sz w:val="20"/>
         </w:rPr>
-        <w:t>P?gina de ayuda con preguntas frecuentes.</w:t>
-      </w:r>
-    </w:p>
-    <w:p>
-      <w:r>
-        <w:br w:type="page"/>
+        <w:t>Ayuda y preguntas frecuentes</w:t>
       </w:r>
     </w:p>
     <w:p>
       <w:pPr>
-        <w:spacing w:before="120" w:after="120"/>
+        <w:spacing w:before="200" w:after="120"/>
       </w:pPr>
       <w:r>
         <w:rPr>
           <w:rFonts w:ascii="Arial" w:hAnsi="Arial"/>
           <w:b/>
-          <w:color w:val="262626"/>
-          <w:sz w:val="26"/>
+          <w:sz w:val="24"/>
         </w:rPr>
-        <w:t>Figura 7. Mapa del sitio con secciones principales, cuenta y soporte.</w:t>
+        <w:t>Mapa del sitio</w:t>
       </w:r>
     </w:p>
     <w:p>
       <w:r>
         <w:drawing>
           <wp:inline xmlns:a="http://schemas.openxmlformats.org/drawingml/2006/main" xmlns:pic="http://schemas.openxmlformats.org/drawingml/2006/picture">
-            <wp:extent cx="5897880" cy="3885865"/>
+            <wp:extent cx="5577840" cy="3675004"/>
             <wp:docPr id="7" name="Picture 7"/>
             <wp:cNvGraphicFramePr>
               <a:graphicFrameLocks noChangeAspect="1"/>
@@ -2882,7 +1720,7 @@
                   <pic:spPr>
                     <a:xfrm>
                       <a:off x="0" y="0"/>
-                      <a:ext cx="5897880" cy="3885865"/>
+                      <a:ext cx="5577840" cy="3675004"/>
                     </a:xfrm>
                     <a:prstGeom prst="rect"/>
                   </pic:spPr>
@@ -2895,42 +1733,35 @@
     </w:p>
     <w:p>
       <w:pPr>
-        <w:spacing w:line="360" w:lineRule="auto" w:after="120"/>
-        <w:jc w:val="both"/>
+        <w:jc w:val="center"/>
       </w:pPr>
       <w:r>
         <w:rPr>
           <w:rFonts w:ascii="Arial" w:hAnsi="Arial"/>
-          <w:b w:val="0"/>
+          <w:i/>
           <w:sz w:val="20"/>
         </w:rPr>
-        <w:t>Mapa del sitio con secciones principales, cuenta y soporte.</w:t>
-      </w:r>
-    </w:p>
-    <w:p>
-      <w:r>
-        <w:br w:type="page"/>
+        <w:t>Mapa del sitio</w:t>
       </w:r>
     </w:p>
     <w:p>
       <w:pPr>
-        <w:spacing w:before="120" w:after="120"/>
+        <w:spacing w:before="200" w:after="120"/>
       </w:pPr>
       <w:r>
         <w:rPr>
           <w:rFonts w:ascii="Arial" w:hAnsi="Arial"/>
           <w:b/>
-          <w:color w:val="262626"/>
-          <w:sz w:val="26"/>
+          <w:sz w:val="24"/>
         </w:rPr>
-        <w:t>Figura 8. P?gina 404 personalizada con enlaces de retorno.</w:t>
+        <w:t>Pagina 404</w:t>
       </w:r>
     </w:p>
     <w:p>
       <w:r>
         <w:drawing>
           <wp:inline xmlns:a="http://schemas.openxmlformats.org/drawingml/2006/main" xmlns:pic="http://schemas.openxmlformats.org/drawingml/2006/picture">
-            <wp:extent cx="5897880" cy="3885865"/>
+            <wp:extent cx="5577840" cy="3675004"/>
             <wp:docPr id="8" name="Picture 8"/>
             <wp:cNvGraphicFramePr>
               <a:graphicFrameLocks noChangeAspect="1"/>
@@ -2951,7 +1782,7 @@
                   <pic:spPr>
                     <a:xfrm>
                       <a:off x="0" y="0"/>
-                      <a:ext cx="5897880" cy="3885865"/>
+                      <a:ext cx="5577840" cy="3675004"/>
                     </a:xfrm>
                     <a:prstGeom prst="rect"/>
                   </pic:spPr>
@@ -2964,16 +1795,15 @@
     </w:p>
     <w:p>
       <w:pPr>
-        <w:spacing w:line="360" w:lineRule="auto" w:after="120"/>
-        <w:jc w:val="both"/>
+        <w:jc w:val="center"/>
       </w:pPr>
       <w:r>
         <w:rPr>
           <w:rFonts w:ascii="Arial" w:hAnsi="Arial"/>
-          <w:b w:val="0"/>
+          <w:i/>
           <w:sz w:val="20"/>
         </w:rPr>
-        <w:t>P?gina 404 personalizada con enlaces de retorno.</w:t>
+        <w:t>Pagina 404</w:t>
       </w:r>
     </w:p>
     <w:p>
@@ -2989,52 +1819,29 @@
         <w:rPr>
           <w:rFonts w:ascii="Arial" w:hAnsi="Arial"/>
           <w:b/>
-          <w:color w:val="262626"/>
-          <w:sz w:val="32"/>
+          <w:sz w:val="28"/>
         </w:rPr>
         <w:t>Conclusiones</w:t>
       </w:r>
     </w:p>
     <w:p>
-      <w:pPr>
-        <w:spacing w:line="360" w:lineRule="auto" w:after="120"/>
-        <w:jc w:val="both"/>
-      </w:pPr>
       <w:r>
         <w:rPr>
           <w:rFonts w:ascii="Arial" w:hAnsi="Arial"/>
           <w:b w:val="0"/>
           <w:sz w:val="24"/>
         </w:rPr>
-        <w:t>El proyecto Ferreter?a Valdez cumple con los requisitos solicitados para la Unidad 1 al integrar un frontend completo, navegaci?n clara, cat?logo funcional, formularios con validaciones, verificaci?n humana y backend b?sico con persistencia mediante archivos JSON.</w:t>
+        <w:t>Ferreteria Valdez cumple con los requisitos solicitados para la Unidad 1. El proyecto integra una interfaz completa, catalogo funcional, formularios validados, captcha en registro y contacto, pagina 404, mapa del sitio y backend con almacenamiento en archivos JSON.</w:t>
       </w:r>
     </w:p>
     <w:p>
-      <w:pPr>
-        <w:spacing w:line="360" w:lineRule="auto" w:after="120"/>
-        <w:jc w:val="both"/>
-      </w:pPr>
       <w:r>
         <w:rPr>
           <w:rFonts w:ascii="Arial" w:hAnsi="Arial"/>
           <w:b w:val="0"/>
           <w:sz w:val="24"/>
         </w:rPr>
-        <w:t>La versi?n final conserva el dise?o visual del frontend de Stitch y agrega las funciones necesarias para que el sitio no sea ?nicamente demostrativo, sino tambi?n verificable desde rutas API y archivos de datos.</w:t>
-      </w:r>
-    </w:p>
-    <w:p>
-      <w:pPr>
-        <w:spacing w:line="360" w:lineRule="auto" w:after="120"/>
-        <w:jc w:val="both"/>
-      </w:pPr>
-      <w:r>
-        <w:rPr>
-          <w:rFonts w:ascii="Arial" w:hAnsi="Arial"/>
-          <w:b w:val="0"/>
-          <w:sz w:val="24"/>
-        </w:rPr>
-        <w:t>Como trabajo complementario de entrega, el proyecto queda preparado para publicarse en GitHub y acompa?arse con este documento de evidencias para la revisi?n docente.</w:t>
+        <w:t>El repositorio queda preparado para subirse a GitHub y el presente documento funciona como evidencia de la implementacion y verificacion general del sistema.</w:t>
       </w:r>
     </w:p>
     <w:p>
@@ -3045,75 +1852,19 @@
         <w:rPr>
           <w:rFonts w:ascii="Arial" w:hAnsi="Arial"/>
           <w:b/>
-          <w:color w:val="262626"/>
-          <w:sz w:val="32"/>
+          <w:sz w:val="28"/>
         </w:rPr>
-        <w:t>Fuentes y referencias</w:t>
+        <w:t>Repositorio</w:t>
       </w:r>
     </w:p>
     <w:p>
-      <w:pPr>
-        <w:spacing w:line="360" w:lineRule="auto"/>
-        <w:ind w:left="360" w:hanging="360"/>
-      </w:pPr>
       <w:r>
         <w:rPr>
           <w:rFonts w:ascii="Arial" w:hAnsi="Arial"/>
+          <w:b w:val="0"/>
           <w:sz w:val="24"/>
         </w:rPr>
-        <w:t>React. (2026). Documentaci?n oficial de React. https://react.dev/</w:t>
-      </w:r>
-    </w:p>
-    <w:p>
-      <w:pPr>
-        <w:spacing w:line="360" w:lineRule="auto"/>
-        <w:ind w:left="360" w:hanging="360"/>
-      </w:pPr>
-      <w:r>
-        <w:rPr>
-          <w:rFonts w:ascii="Arial" w:hAnsi="Arial"/>
-          <w:sz w:val="24"/>
-        </w:rPr>
-        <w:t>Vite. (2026). Documentaci?n oficial de Vite. https://vite.dev/</w:t>
-      </w:r>
-    </w:p>
-    <w:p>
-      <w:pPr>
-        <w:spacing w:line="360" w:lineRule="auto"/>
-        <w:ind w:left="360" w:hanging="360"/>
-      </w:pPr>
-      <w:r>
-        <w:rPr>
-          <w:rFonts w:ascii="Arial" w:hAnsi="Arial"/>
-          <w:sz w:val="24"/>
-        </w:rPr>
-        <w:t>Node.js. (2026). Documentaci?n oficial de Node.js. https://nodejs.org/</w:t>
-      </w:r>
-    </w:p>
-    <w:p>
-      <w:pPr>
-        <w:spacing w:line="360" w:lineRule="auto"/>
-        <w:ind w:left="360" w:hanging="360"/>
-      </w:pPr>
-      <w:r>
-        <w:rPr>
-          <w:rFonts w:ascii="Arial" w:hAnsi="Arial"/>
-          <w:sz w:val="24"/>
-        </w:rPr>
-        <w:t>Tailwind CSS. (2026). Documentaci?n oficial de Tailwind CSS. https://tailwindcss.com/</w:t>
-      </w:r>
-    </w:p>
-    <w:p>
-      <w:pPr>
-        <w:spacing w:line="360" w:lineRule="auto"/>
-        <w:ind w:left="360" w:hanging="360"/>
-      </w:pPr>
-      <w:r>
-        <w:rPr>
-          <w:rFonts w:ascii="Arial" w:hAnsi="Arial"/>
-          <w:sz w:val="24"/>
-        </w:rPr>
-        <w:t>Repositorio del proyecto: https://github.com/AlejandroVz0/ValdezLaraYahirAlejandroUnidad1</w:t>
+        <w:t>https://github.com/AlejandroVz0/ValdezLaraYahirAlejandroUnidad1</w:t>
       </w:r>
     </w:p>
     <w:sectPr>
@@ -3493,7 +2244,7 @@
       <w:spacing w:line="360" w:lineRule="auto" w:after="120"/>
     </w:pPr>
     <w:rPr>
-      <w:rFonts w:ascii="Arial" w:hAnsi="Arial" w:eastAsia="Arial"/>
+      <w:rFonts w:ascii="Arial" w:hAnsi="Arial"/>
       <w:sz w:val="24"/>
     </w:rPr>
   </w:style>

</xml_diff>

<commit_message>
Actualiza README y documento de entrega
</commit_message>
<xml_diff>
--- a/docs/U1-SH-DWP-ValdezLaraYahirAlejandro.docx
+++ b/docs/U1-SH-DWP-ValdezLaraYahirAlejandro.docx
@@ -348,17 +348,10 @@
           <w:b w:val="0"/>
           <w:sz w:val="24"/>
         </w:rPr>
-        <w:t>El presente documento describe el desarrollo del sitio web Ferreteria Valdez, una ferreteria ficticia inspirada en negocios reales de Ramos Arizpe, Coahuila. El sitio muestra catalogo de productos, permite cotizaciones y presenta formularios funcionales conectados a un backend basico.</w:t>
-      </w:r>
-    </w:p>
-    <w:p>
-      <w:r>
-        <w:rPr>
-          <w:rFonts w:ascii="Arial" w:hAnsi="Arial"/>
-          <w:b w:val="0"/>
-          <w:sz w:val="24"/>
-        </w:rPr>
-        <w:t>La interfaz visual toma como base el frontend generado en Stitch y se adapto para cumplir con los requisitos de la Unidad 1: ayuda, mapa del sitio, pagina 404, contacto, login, registro, recuperacion y almacenamiento JSON.</w:t>
+        <w:t>En este proyecto se desarrollo el sitio web de Ferreteria Valdez, que es una ferreteria ficticia inspirada en negocios reales de Ramos Arizpe, Coahuila. La idea principal fue crear una pagina que se viera moderna, ordenada y util para los clientes, pero que al mismo tiempo cumpliera con todos los requisitos que se pidieron en la materia de Desarrollo Web Profesional. Durante la realizacion del trabajo se fueron integrando varias secciones importantes como el inicio, el catalogo de productos, el area de ayuda, el contacto, el mapa del sitio y la pagina de error 404. Tambien se agregaron formularios de registro, inicio de sesion y recuperacion de contrasena para que el sitio se sintiera mas completo y funcional.</w:t>
+        <w:br/>
+        <w:br/>
+        <w:t>Ademas de la parte visual, este proyecto tambien incluye un backend basico en Node.js para guardar informacion en archivos JSON, como usuarios, mensajes y productos. Eso hace que la pagina no sea solo de presentacion, sino que tambien tenga funciones reales para practicar mejor lo aprendido. En general, este trabajo me ayudo a entender mejor como se relacionan el frontend y el backend dentro de un mismo proyecto, y tambien me permitio reforzar temas como validaciones, rutas, estructura de carpetas, estilo responsivo y documentacion final para una entrega formal.</w:t>
       </w:r>
     </w:p>
     <w:p>
@@ -1831,17 +1824,10 @@
           <w:b w:val="0"/>
           <w:sz w:val="24"/>
         </w:rPr>
-        <w:t>Ferreteria Valdez cumple con los requisitos solicitados para la Unidad 1. El proyecto integra una interfaz completa, catalogo funcional, formularios validados, captcha en registro y contacto, pagina 404, mapa del sitio y backend con almacenamiento en archivos JSON.</w:t>
-      </w:r>
-    </w:p>
-    <w:p>
-      <w:r>
-        <w:rPr>
-          <w:rFonts w:ascii="Arial" w:hAnsi="Arial"/>
-          <w:b w:val="0"/>
-          <w:sz w:val="24"/>
-        </w:rPr>
-        <w:t>El repositorio queda preparado para subirse a GitHub y el presente documento funciona como evidencia de la implementacion y verificacion general del sistema.</w:t>
+        <w:t>Como conclusion, considero que el proyecto de Ferreteria Valdez cumplio de buena manera con los objetivos planteados para esta unidad, ya que no solo se logro hacer una pagina con buena presentacion, sino tambien un sitio mas completo y funcional. A lo largo del desarrollo se integraron elementos importantes que ayudan a que la experiencia del usuario sea mejor, por ejemplo el catalogo con filtros, el formulario de contacto, la ayuda, el mapa del sitio y la pagina 404 personalizada. Tambien fue importante agregar validaciones en los formularios y una verificacion humana sencilla, porque eso hace que el sitio se vea mas serio y mejor pensado. Otra parte valiosa fue conectar el frontend con un backend basico, ya que asi se pudo guardar informacion de usuarios y mensajes en archivos JSON.</w:t>
+        <w:br/>
+        <w:br/>
+        <w:t>Este trabajo tambien me dejo como aprendizaje que hacer una pagina web no solo es poner colores o texto en pantalla, sino organizar bien la informacion, pensar en lo que necesita el usuario y comprobar que todo funcione correctamente. Igualmente, me sirvio para practicar el uso de herramientas como GitHub, la estructura de un proyecto web y la importancia de documentar el proceso. En mi opinion, fue una actividad muy completa porque permitio aplicar conocimientos tecnicos y al mismo tiempo mejorar la manera de presentar un proyecto final.</w:t>
       </w:r>
     </w:p>
     <w:p>

</xml_diff>